<commit_message>
Update Week 02 CP-2
</commit_message>
<xml_diff>
--- a/Weekly Progress Report/weekly-progress-report.docx
+++ b/Weekly Progress Report/weekly-progress-report.docx
@@ -276,7 +276,15 @@
         <w:tab/>
       </w:r>
       <w:r>
-        <w:t xml:space="preserve">Mr. Aamir Zia </w:t>
+        <w:t xml:space="preserve">Mr. </w:t>
+      </w:r>
+      <w:proofErr w:type="spellStart"/>
+      <w:r>
+        <w:t>Aamir</w:t>
+      </w:r>
+      <w:proofErr w:type="spellEnd"/>
+      <w:r>
+        <w:t xml:space="preserve"> Zia </w:t>
       </w:r>
       <w:r>
         <w:rPr>
@@ -318,11 +326,19 @@
         </w:rPr>
         <w:t xml:space="preserve"> </w:t>
       </w:r>
+      <w:proofErr w:type="spellStart"/>
       <w:r>
         <w:rPr>
           <w:spacing w:val="-2"/>
         </w:rPr>
-        <w:t xml:space="preserve">Ilyas </w:t>
+        <w:t>Ilyas</w:t>
+      </w:r>
+      <w:proofErr w:type="spellEnd"/>
+      <w:r>
+        <w:rPr>
+          <w:spacing w:val="-2"/>
+        </w:rPr>
+        <w:t xml:space="preserve"> </w:t>
       </w:r>
       <w:r>
         <w:rPr>
@@ -402,9 +418,11 @@
         </w:rPr>
         <w:t xml:space="preserve"> </w:t>
       </w:r>
+      <w:proofErr w:type="spellStart"/>
       <w:r>
         <w:t>Ullah</w:t>
       </w:r>
+      <w:proofErr w:type="spellEnd"/>
       <w:r>
         <w:rPr>
           <w:spacing w:val="-9"/>
@@ -454,6 +472,7 @@
         </w:rPr>
         <w:t xml:space="preserve"> </w:t>
       </w:r>
+      <w:proofErr w:type="spellStart"/>
       <w:r>
         <w:rPr>
           <w:color w:val="2C74B5"/>
@@ -461,6 +480,7 @@
         </w:rPr>
         <w:t>Github</w:t>
       </w:r>
+      <w:proofErr w:type="spellEnd"/>
       <w:r>
         <w:rPr>
           <w:color w:val="2C74B5"/>
@@ -1055,7 +1075,23 @@
                                       <w:b/>
                                       <w:sz w:val="24"/>
                                     </w:rPr>
-                                    <w:t xml:space="preserve">Member ( Muhammad Najee Ullah </w:t>
+                                    <w:t xml:space="preserve">Member ( Muhammad Najee </w:t>
+                                  </w:r>
+                                  <w:proofErr w:type="spellStart"/>
+                                  <w:r>
+                                    <w:rPr>
+                                      <w:b/>
+                                      <w:sz w:val="24"/>
+                                    </w:rPr>
+                                    <w:t>Ullah</w:t>
+                                  </w:r>
+                                  <w:proofErr w:type="spellEnd"/>
+                                  <w:r>
+                                    <w:rPr>
+                                      <w:b/>
+                                      <w:sz w:val="24"/>
+                                    </w:rPr>
+                                    <w:t xml:space="preserve"> </w:t>
                                   </w:r>
                                   <w:r>
                                     <w:rPr>
@@ -1376,7 +1412,15 @@
                                     <w:t xml:space="preserve"> </w:t>
                                   </w:r>
                                   <w:r>
-                                    <w:t>project. And also discussed ideas</w:t>
+                                    <w:t xml:space="preserve">project. </w:t>
+                                  </w:r>
+                                  <w:proofErr w:type="gramStart"/>
+                                  <w:r>
+                                    <w:t>And also</w:t>
+                                  </w:r>
+                                  <w:proofErr w:type="gramEnd"/>
+                                  <w:r>
+                                    <w:t xml:space="preserve"> discussed ideas</w:t>
                                   </w:r>
                                   <w:r>
                                     <w:rPr>
@@ -2995,7 +3039,23 @@
                                 <w:b/>
                                 <w:sz w:val="24"/>
                               </w:rPr>
-                              <w:t xml:space="preserve">Member ( Muhammad Najee Ullah </w:t>
+                              <w:t xml:space="preserve">Member ( Muhammad Najee </w:t>
+                            </w:r>
+                            <w:proofErr w:type="spellStart"/>
+                            <w:r>
+                              <w:rPr>
+                                <w:b/>
+                                <w:sz w:val="24"/>
+                              </w:rPr>
+                              <w:t>Ullah</w:t>
+                            </w:r>
+                            <w:proofErr w:type="spellEnd"/>
+                            <w:r>
+                              <w:rPr>
+                                <w:b/>
+                                <w:sz w:val="24"/>
+                              </w:rPr>
+                              <w:t xml:space="preserve"> </w:t>
                             </w:r>
                             <w:r>
                               <w:rPr>
@@ -3316,7 +3376,15 @@
                               <w:t xml:space="preserve"> </w:t>
                             </w:r>
                             <w:r>
-                              <w:t>project. And also discussed ideas</w:t>
+                              <w:t xml:space="preserve">project. </w:t>
+                            </w:r>
+                            <w:proofErr w:type="gramStart"/>
+                            <w:r>
+                              <w:t>And also</w:t>
+                            </w:r>
+                            <w:proofErr w:type="gramEnd"/>
+                            <w:r>
+                              <w:t xml:space="preserve"> discussed ideas</w:t>
                             </w:r>
                             <w:r>
                               <w:rPr>
@@ -5034,7 +5102,15 @@
               <w:t xml:space="preserve"> </w:t>
             </w:r>
             <w:r>
-              <w:t>for his approval. Also we are talking about</w:t>
+              <w:t xml:space="preserve">for his approval. </w:t>
+            </w:r>
+            <w:proofErr w:type="gramStart"/>
+            <w:r>
+              <w:t>Also</w:t>
+            </w:r>
+            <w:proofErr w:type="gramEnd"/>
+            <w:r>
+              <w:t xml:space="preserve"> we are talking about</w:t>
             </w:r>
             <w:r>
               <w:rPr>
@@ -5503,6 +5579,7 @@
               <w:pStyle w:val="TableParagraph"/>
               <w:ind w:left="1643" w:right="1847"/>
             </w:pPr>
+            <w:proofErr w:type="gramStart"/>
             <w:r>
               <w:t>No</w:t>
             </w:r>
@@ -5551,6 +5628,7 @@
             <w:r>
               <w:t>us</w:t>
             </w:r>
+            <w:proofErr w:type="gramEnd"/>
             <w:r>
               <w:rPr>
                 <w:spacing w:val="-9"/>
@@ -5858,6 +5936,7 @@
               </w:rPr>
               <w:t xml:space="preserve"> </w:t>
             </w:r>
+            <w:proofErr w:type="gramStart"/>
             <w:r>
               <w:t>was</w:t>
             </w:r>
@@ -5871,7 +5950,14 @@
               <w:rPr>
                 <w:spacing w:val="-4"/>
               </w:rPr>
-              <w:t>done.</w:t>
+              <w:t>done</w:t>
+            </w:r>
+            <w:proofErr w:type="gramEnd"/>
+            <w:r>
+              <w:rPr>
+                <w:spacing w:val="-4"/>
+              </w:rPr>
+              <w:t>.</w:t>
             </w:r>
           </w:p>
         </w:tc>
@@ -5931,6 +6017,7 @@
               </w:rPr>
               <w:t xml:space="preserve"> </w:t>
             </w:r>
+            <w:proofErr w:type="gramStart"/>
             <w:r>
               <w:t>was</w:t>
             </w:r>
@@ -5944,7 +6031,14 @@
               <w:rPr>
                 <w:spacing w:val="-4"/>
               </w:rPr>
-              <w:t>done.</w:t>
+              <w:t>done</w:t>
+            </w:r>
+            <w:proofErr w:type="gramEnd"/>
+            <w:r>
+              <w:rPr>
+                <w:spacing w:val="-4"/>
+              </w:rPr>
+              <w:t>.</w:t>
             </w:r>
           </w:p>
         </w:tc>
@@ -6635,6 +6729,7 @@
               </w:rPr>
               <w:t xml:space="preserve"> </w:t>
             </w:r>
+            <w:proofErr w:type="gramStart"/>
             <w:r>
               <w:t>made</w:t>
             </w:r>
@@ -6650,6 +6745,7 @@
               </w:rPr>
               <w:t>.</w:t>
             </w:r>
+            <w:proofErr w:type="gramEnd"/>
           </w:p>
           <w:p>
             <w:pPr>
@@ -8778,7 +8874,15 @@
               <w:ind w:left="100"/>
             </w:pPr>
             <w:r>
-              <w:t>Made a Model of User for user registration and login . If User credentials</w:t>
+              <w:t xml:space="preserve">Made a Model of User for user registration and </w:t>
+            </w:r>
+            <w:proofErr w:type="gramStart"/>
+            <w:r>
+              <w:t>login .</w:t>
+            </w:r>
+            <w:proofErr w:type="gramEnd"/>
+            <w:r>
+              <w:t xml:space="preserve"> If User credentials</w:t>
             </w:r>
             <w:r>
               <w:rPr>
@@ -10302,7 +10406,23 @@
                 <w:b/>
                 <w:sz w:val="24"/>
               </w:rPr>
-              <w:t xml:space="preserve">( Muhammad Najee Ullah </w:t>
+              <w:t xml:space="preserve">( Muhammad Najee </w:t>
+            </w:r>
+            <w:proofErr w:type="spellStart"/>
+            <w:r>
+              <w:rPr>
+                <w:b/>
+                <w:sz w:val="24"/>
+              </w:rPr>
+              <w:t>Ullah</w:t>
+            </w:r>
+            <w:proofErr w:type="spellEnd"/>
+            <w:r>
+              <w:rPr>
+                <w:b/>
+                <w:sz w:val="24"/>
+              </w:rPr>
+              <w:t xml:space="preserve"> </w:t>
             </w:r>
             <w:r>
               <w:rPr>
@@ -10449,11 +10569,19 @@
               </w:rPr>
               <w:t xml:space="preserve">Used </w:t>
             </w:r>
-            <w:r>
-              <w:rPr>
-                <w:sz w:val="24"/>
-              </w:rPr>
-              <w:t>Cloudinary for User Images</w:t>
+            <w:proofErr w:type="spellStart"/>
+            <w:r>
+              <w:rPr>
+                <w:sz w:val="24"/>
+              </w:rPr>
+              <w:t>Cloudinary</w:t>
+            </w:r>
+            <w:proofErr w:type="spellEnd"/>
+            <w:r>
+              <w:rPr>
+                <w:sz w:val="24"/>
+              </w:rPr>
+              <w:t xml:space="preserve"> for User Images</w:t>
             </w:r>
           </w:p>
           <w:p>
@@ -10506,11 +10634,19 @@
                 <w:sz w:val="24"/>
               </w:rPr>
             </w:pPr>
-            <w:r>
-              <w:rPr>
-                <w:sz w:val="24"/>
-              </w:rPr>
-              <w:t>tab on his dashboard.</w:t>
+            <w:proofErr w:type="gramStart"/>
+            <w:r>
+              <w:rPr>
+                <w:sz w:val="24"/>
+              </w:rPr>
+              <w:t>tab</w:t>
+            </w:r>
+            <w:proofErr w:type="gramEnd"/>
+            <w:r>
+              <w:rPr>
+                <w:sz w:val="24"/>
+              </w:rPr>
+              <w:t xml:space="preserve"> on his dashboard.</w:t>
             </w:r>
           </w:p>
           <w:p>
@@ -10528,7 +10664,35 @@
               <w:rPr>
                 <w:sz w:val="24"/>
               </w:rPr>
-              <w:t>Updated Users Tab in Admin Dashboard . All users will be displayed on that tab and admin can also change the role of the user.</w:t>
+              <w:t xml:space="preserve">Updated Users Tab in Admin </w:t>
+            </w:r>
+            <w:proofErr w:type="gramStart"/>
+            <w:r>
+              <w:rPr>
+                <w:sz w:val="24"/>
+              </w:rPr>
+              <w:t>Dashboard .</w:t>
+            </w:r>
+            <w:proofErr w:type="gramEnd"/>
+            <w:r>
+              <w:rPr>
+                <w:sz w:val="24"/>
+              </w:rPr>
+              <w:t xml:space="preserve"> All users will be displayed on that tab and admin </w:t>
+            </w:r>
+            <w:proofErr w:type="gramStart"/>
+            <w:r>
+              <w:rPr>
+                <w:sz w:val="24"/>
+              </w:rPr>
+              <w:t>can also</w:t>
+            </w:r>
+            <w:proofErr w:type="gramEnd"/>
+            <w:r>
+              <w:rPr>
+                <w:sz w:val="24"/>
+              </w:rPr>
+              <w:t xml:space="preserve"> change the role of the user.</w:t>
             </w:r>
           </w:p>
           <w:p>
@@ -10546,7 +10710,21 @@
               <w:rPr>
                 <w:sz w:val="24"/>
               </w:rPr>
-              <w:t xml:space="preserve">On register page. If the user has registered he have to activate his account </w:t>
+              <w:t xml:space="preserve">On register page. If the user has </w:t>
+            </w:r>
+            <w:proofErr w:type="gramStart"/>
+            <w:r>
+              <w:rPr>
+                <w:sz w:val="24"/>
+              </w:rPr>
+              <w:t>registered</w:t>
+            </w:r>
+            <w:proofErr w:type="gramEnd"/>
+            <w:r>
+              <w:rPr>
+                <w:sz w:val="24"/>
+              </w:rPr>
+              <w:t xml:space="preserve"> he have to activate his account </w:t>
             </w:r>
             <w:r>
               <w:rPr>
@@ -10582,7 +10760,21 @@
               <w:rPr>
                 <w:sz w:val="24"/>
               </w:rPr>
-              <w:t>As user logins it</w:t>
+              <w:t xml:space="preserve">As user </w:t>
+            </w:r>
+            <w:proofErr w:type="gramStart"/>
+            <w:r>
+              <w:rPr>
+                <w:sz w:val="24"/>
+              </w:rPr>
+              <w:t>logins</w:t>
+            </w:r>
+            <w:proofErr w:type="gramEnd"/>
+            <w:r>
+              <w:rPr>
+                <w:sz w:val="24"/>
+              </w:rPr>
+              <w:t xml:space="preserve"> it</w:t>
             </w:r>
             <w:r>
               <w:rPr>
@@ -10647,56 +10839,25 @@
                 <w:sz w:val="24"/>
               </w:rPr>
             </w:pPr>
-            <w:r>
-              <w:rPr>
-                <w:sz w:val="24"/>
-              </w:rPr>
-              <w:t>Now Admin can chat with Doctors and Receptionist.</w:t>
-            </w:r>
-          </w:p>
-          <w:p>
-            <w:pPr>
-              <w:pStyle w:val="TableParagraph"/>
-              <w:ind w:left="720"/>
-              <w:rPr>
-                <w:sz w:val="24"/>
-              </w:rPr>
-            </w:pPr>
-            <w:r>
-              <w:rPr>
-                <w:sz w:val="24"/>
-              </w:rPr>
-              <w:t>Doctor with Patient and Receptionist.</w:t>
-            </w:r>
-          </w:p>
-          <w:p>
-            <w:pPr>
-              <w:pStyle w:val="TableParagraph"/>
-              <w:ind w:left="720"/>
-              <w:rPr>
-                <w:sz w:val="24"/>
-              </w:rPr>
-            </w:pPr>
-            <w:r>
-              <w:rPr>
-                <w:sz w:val="24"/>
-              </w:rPr>
-              <w:t>Receptionist with Patient, Doctor &amp; Admin.</w:t>
-            </w:r>
-          </w:p>
-          <w:p>
-            <w:pPr>
-              <w:pStyle w:val="TableParagraph"/>
-              <w:ind w:left="720"/>
-              <w:rPr>
-                <w:sz w:val="24"/>
-              </w:rPr>
-            </w:pPr>
-            <w:r>
-              <w:rPr>
-                <w:sz w:val="24"/>
-              </w:rPr>
-              <w:t>Patient can chat with Doctor &amp; Receptionist.</w:t>
+            <w:proofErr w:type="gramStart"/>
+            <w:r>
+              <w:rPr>
+                <w:sz w:val="24"/>
+              </w:rPr>
+              <w:t>So</w:t>
+            </w:r>
+            <w:proofErr w:type="gramEnd"/>
+            <w:r>
+              <w:rPr>
+                <w:sz w:val="24"/>
+              </w:rPr>
+              <w:t xml:space="preserve"> the users can message each other</w:t>
+            </w:r>
+            <w:r>
+              <w:rPr>
+                <w:sz w:val="24"/>
+              </w:rPr>
+              <w:t>.</w:t>
             </w:r>
           </w:p>
           <w:p>
@@ -10716,11 +10877,19 @@
               </w:rPr>
               <w:t xml:space="preserve">Also added Notification component in the Dashboards headers. For </w:t>
             </w:r>
-            <w:r>
-              <w:rPr>
-                <w:sz w:val="24"/>
-              </w:rPr>
-              <w:t>now no functionality is added to</w:t>
+            <w:proofErr w:type="gramStart"/>
+            <w:r>
+              <w:rPr>
+                <w:sz w:val="24"/>
+              </w:rPr>
+              <w:t>now</w:t>
+            </w:r>
+            <w:proofErr w:type="gramEnd"/>
+            <w:r>
+              <w:rPr>
+                <w:sz w:val="24"/>
+              </w:rPr>
+              <w:t xml:space="preserve"> no functionality is added to</w:t>
             </w:r>
             <w:r>
               <w:rPr>
@@ -10744,8 +10913,42 @@
               <w:rPr>
                 <w:sz w:val="24"/>
               </w:rPr>
+              <w:t xml:space="preserve">Implemented Whisper Ai for converting Speech to </w:t>
+            </w:r>
+            <w:proofErr w:type="gramStart"/>
+            <w:r>
+              <w:rPr>
+                <w:sz w:val="24"/>
+              </w:rPr>
+              <w:t>Text .</w:t>
+            </w:r>
+            <w:proofErr w:type="gramEnd"/>
+            <w:r>
+              <w:rPr>
+                <w:sz w:val="24"/>
+              </w:rPr>
+              <w:t xml:space="preserve"> Languages will </w:t>
+            </w:r>
+            <w:proofErr w:type="gramStart"/>
+            <w:r>
+              <w:rPr>
+                <w:sz w:val="24"/>
+              </w:rPr>
+              <w:t>be  English</w:t>
+            </w:r>
+            <w:proofErr w:type="gramEnd"/>
+            <w:r>
+              <w:rPr>
+                <w:sz w:val="24"/>
+              </w:rPr>
+              <w:t xml:space="preserve"> and Urdu. Final conversation will be </w:t>
+            </w:r>
+            <w:r>
+              <w:rPr>
+                <w:sz w:val="24"/>
+              </w:rPr>
               <w:lastRenderedPageBreak/>
-              <w:t>Implemented Whisper Ai for converting Speech to Text . Languages will be  English and Urdu. Final conversation will be converted into text</w:t>
+              <w:t>converted into text</w:t>
             </w:r>
           </w:p>
           <w:p>
@@ -10763,7 +10966,35 @@
               <w:rPr>
                 <w:sz w:val="24"/>
               </w:rPr>
-              <w:t>As whisper converts voice to text that text will be used to generate SOAP notes for doctor and extracts medical info so that patient report can be made from that. Also Updated Patient and Doctor Dashboard so information from Database will be displayed there.</w:t>
+              <w:t xml:space="preserve">As whisper converts voice to text that text </w:t>
+            </w:r>
+            <w:proofErr w:type="gramStart"/>
+            <w:r>
+              <w:rPr>
+                <w:sz w:val="24"/>
+              </w:rPr>
+              <w:t>will be used</w:t>
+            </w:r>
+            <w:proofErr w:type="gramEnd"/>
+            <w:r>
+              <w:rPr>
+                <w:sz w:val="24"/>
+              </w:rPr>
+              <w:t xml:space="preserve"> to generate SOAP notes for doctor and extracts medical info so that patient report can be made from that. Also Updated Patient and Doctor Dashboard so information from Database </w:t>
+            </w:r>
+            <w:proofErr w:type="gramStart"/>
+            <w:r>
+              <w:rPr>
+                <w:sz w:val="24"/>
+              </w:rPr>
+              <w:t>will be displayed</w:t>
+            </w:r>
+            <w:proofErr w:type="gramEnd"/>
+            <w:r>
+              <w:rPr>
+                <w:sz w:val="24"/>
+              </w:rPr>
+              <w:t xml:space="preserve"> there.</w:t>
             </w:r>
           </w:p>
           <w:p>
@@ -10796,7 +11027,21 @@
               <w:rPr>
                 <w:sz w:val="24"/>
               </w:rPr>
-              <w:t>In Doctor dashboard stats appointment and patient records are updated with real data.</w:t>
+              <w:t xml:space="preserve">In </w:t>
+            </w:r>
+            <w:proofErr w:type="gramStart"/>
+            <w:r>
+              <w:rPr>
+                <w:sz w:val="24"/>
+              </w:rPr>
+              <w:t>Doctor</w:t>
+            </w:r>
+            <w:proofErr w:type="gramEnd"/>
+            <w:r>
+              <w:rPr>
+                <w:sz w:val="24"/>
+              </w:rPr>
+              <w:t xml:space="preserve"> dashboard stats appointment and patient records are updated with real data.</w:t>
             </w:r>
           </w:p>
           <w:p>
@@ -10885,7 +11130,21 @@
               <w:rPr>
                 <w:sz w:val="24"/>
               </w:rPr>
-              <w:t>atient schedules appointment which goes into pending state until doctor confirms it in his dashboard</w:t>
+              <w:t xml:space="preserve">atient schedules </w:t>
+            </w:r>
+            <w:proofErr w:type="gramStart"/>
+            <w:r>
+              <w:rPr>
+                <w:sz w:val="24"/>
+              </w:rPr>
+              <w:t>appointment which</w:t>
+            </w:r>
+            <w:proofErr w:type="gramEnd"/>
+            <w:r>
+              <w:rPr>
+                <w:sz w:val="24"/>
+              </w:rPr>
+              <w:t xml:space="preserve"> goes into pending state until doctor confirms it in his dashboard</w:t>
             </w:r>
             <w:r>
               <w:rPr>
@@ -10897,7 +11156,21 @@
               <w:rPr>
                 <w:sz w:val="24"/>
               </w:rPr>
-              <w:t>Fetch appointments in patient dashboard and their current status.</w:t>
+              <w:t xml:space="preserve">Fetch appointments in patient dashboard and their </w:t>
+            </w:r>
+            <w:proofErr w:type="gramStart"/>
+            <w:r>
+              <w:rPr>
+                <w:sz w:val="24"/>
+              </w:rPr>
+              <w:t>current status</w:t>
+            </w:r>
+            <w:proofErr w:type="gramEnd"/>
+            <w:r>
+              <w:rPr>
+                <w:sz w:val="24"/>
+              </w:rPr>
+              <w:t>.</w:t>
             </w:r>
           </w:p>
           <w:p>
@@ -10949,7 +11222,21 @@
               <w:rPr>
                 <w:sz w:val="24"/>
               </w:rPr>
-              <w:t>Receptionist can also manage appointment creation either through individual patient or searching for both patients and doctors in schedule appointment tab.</w:t>
+              <w:t xml:space="preserve">Receptionist can also manage appointment creation </w:t>
+            </w:r>
+            <w:proofErr w:type="gramStart"/>
+            <w:r>
+              <w:rPr>
+                <w:sz w:val="24"/>
+              </w:rPr>
+              <w:t>either through individual patient or searching</w:t>
+            </w:r>
+            <w:proofErr w:type="gramEnd"/>
+            <w:r>
+              <w:rPr>
+                <w:sz w:val="24"/>
+              </w:rPr>
+              <w:t xml:space="preserve"> for both patients and doctors in schedule appointment tab.</w:t>
             </w:r>
           </w:p>
           <w:p>
@@ -11500,7 +11787,23 @@
                 <w:b/>
                 <w:sz w:val="24"/>
               </w:rPr>
-              <w:t xml:space="preserve">( Muhammad Najee Ullah </w:t>
+              <w:t xml:space="preserve">( Muhammad Najee </w:t>
+            </w:r>
+            <w:proofErr w:type="spellStart"/>
+            <w:r>
+              <w:rPr>
+                <w:b/>
+                <w:sz w:val="24"/>
+              </w:rPr>
+              <w:t>Ullah</w:t>
+            </w:r>
+            <w:proofErr w:type="spellEnd"/>
+            <w:r>
+              <w:rPr>
+                <w:b/>
+                <w:sz w:val="24"/>
+              </w:rPr>
+              <w:t xml:space="preserve"> </w:t>
             </w:r>
             <w:r>
               <w:rPr>
@@ -11987,34 +12290,21 @@
                 <w:color w:val="FFFFFF"/>
                 <w:spacing w:val="-5"/>
               </w:rPr>
-              <w:t>02</w:t>
-            </w:r>
-            <w:r>
-              <w:rPr>
-                <w:color w:val="FFFFFF"/>
-                <w:spacing w:val="-5"/>
-              </w:rPr>
-              <w:t>]</w:t>
-            </w:r>
-          </w:p>
-          <w:p>
-            <w:pPr>
-              <w:pStyle w:val="TableParagraph"/>
-              <w:rPr>
-                <w:sz w:val="24"/>
-              </w:rPr>
-            </w:pPr>
-            <w:r>
-              <w:rPr>
-                <w:color w:val="FFFFFF"/>
-              </w:rPr>
-              <w:t xml:space="preserve">      09</w:t>
-            </w:r>
-            <w:r>
-              <w:rPr>
-                <w:color w:val="FFFFFF"/>
-              </w:rPr>
-              <w:t>-Feb-2026</w:t>
+              <w:t>02]</w:t>
+            </w:r>
+          </w:p>
+          <w:p>
+            <w:pPr>
+              <w:pStyle w:val="TableParagraph"/>
+              <w:rPr>
+                <w:sz w:val="24"/>
+              </w:rPr>
+            </w:pPr>
+            <w:r>
+              <w:rPr>
+                <w:color w:val="FFFFFF"/>
+              </w:rPr>
+              <w:t xml:space="preserve">      09-Feb-2026</w:t>
             </w:r>
             <w:r>
               <w:rPr>
@@ -12116,7 +12406,63 @@
               <w:rPr>
                 <w:sz w:val="24"/>
               </w:rPr>
-              <w:t>If the patient appointment is approved then he will be presented with bill which shows the bill of the user and asks him to choose billing method either JazzCash or EasyPaisa or he is going to pay at hospital by visiting receptionist. It requires user to send it to particular account mentioned below after he choose the payment he would be asked to provide a screenshot of that payment in order to verify the payment. It will be verified by the receptionist . After receptionist verifies, the patient can view and download the invoice.</w:t>
+              <w:t xml:space="preserve">If the patient appointment is approved then he will be presented with </w:t>
+            </w:r>
+            <w:proofErr w:type="gramStart"/>
+            <w:r>
+              <w:rPr>
+                <w:sz w:val="24"/>
+              </w:rPr>
+              <w:t>bill which</w:t>
+            </w:r>
+            <w:proofErr w:type="gramEnd"/>
+            <w:r>
+              <w:rPr>
+                <w:sz w:val="24"/>
+              </w:rPr>
+              <w:t xml:space="preserve"> shows the bill of the user and asks him to choose billing method either </w:t>
+            </w:r>
+            <w:proofErr w:type="spellStart"/>
+            <w:r>
+              <w:rPr>
+                <w:sz w:val="24"/>
+              </w:rPr>
+              <w:t>JazzCash</w:t>
+            </w:r>
+            <w:proofErr w:type="spellEnd"/>
+            <w:r>
+              <w:rPr>
+                <w:sz w:val="24"/>
+              </w:rPr>
+              <w:t xml:space="preserve"> or </w:t>
+            </w:r>
+            <w:proofErr w:type="spellStart"/>
+            <w:r>
+              <w:rPr>
+                <w:sz w:val="24"/>
+              </w:rPr>
+              <w:t>EasyPaisa</w:t>
+            </w:r>
+            <w:proofErr w:type="spellEnd"/>
+            <w:r>
+              <w:rPr>
+                <w:sz w:val="24"/>
+              </w:rPr>
+              <w:t xml:space="preserve"> or he is going to pay at hospital by visiting receptionist. It requires user to send it to particular account mentioned below after he choose the payment he would be asked to provide a screenshot of that payment in order to verify the payment. It will be verified by the </w:t>
+            </w:r>
+            <w:proofErr w:type="gramStart"/>
+            <w:r>
+              <w:rPr>
+                <w:sz w:val="24"/>
+              </w:rPr>
+              <w:t>receptionist .</w:t>
+            </w:r>
+            <w:proofErr w:type="gramEnd"/>
+            <w:r>
+              <w:rPr>
+                <w:sz w:val="24"/>
+              </w:rPr>
+              <w:t xml:space="preserve"> After receptionist verifies, the patient can view and download the invoice.</w:t>
             </w:r>
           </w:p>
           <w:p>
@@ -12159,7 +12505,21 @@
               <w:rPr>
                 <w:sz w:val="24"/>
               </w:rPr>
-              <w:t>. At appointments tab added a filter to filter appointments by all, today and upcoming.</w:t>
+              <w:t xml:space="preserve">. At appointments tab added a </w:t>
+            </w:r>
+            <w:proofErr w:type="gramStart"/>
+            <w:r>
+              <w:rPr>
+                <w:sz w:val="24"/>
+              </w:rPr>
+              <w:t>filter to filter</w:t>
+            </w:r>
+            <w:proofErr w:type="gramEnd"/>
+            <w:r>
+              <w:rPr>
+                <w:sz w:val="24"/>
+              </w:rPr>
+              <w:t xml:space="preserve"> appointments by all, today and upcoming.</w:t>
             </w:r>
             <w:r>
               <w:rPr>
@@ -12190,15 +12550,7 @@
               <w:rPr>
                 <w:sz w:val="24"/>
               </w:rPr>
-              <w:t>I</w:t>
-            </w:r>
-            <w:bookmarkStart w:id="0" w:name="_GoBack"/>
-            <w:bookmarkEnd w:id="0"/>
-            <w:r>
-              <w:rPr>
-                <w:sz w:val="24"/>
-              </w:rPr>
-              <w:t>n Patient Dashboard, u</w:t>
+              <w:t>In Patient Dashboard, u</w:t>
             </w:r>
             <w:r>
               <w:rPr>
@@ -12228,6 +12580,192 @@
           <w:p>
             <w:pPr>
               <w:pStyle w:val="TableParagraph"/>
+              <w:cnfStyle w:val="000000000000" w:firstRow="0" w:lastRow="0" w:firstColumn="0" w:lastColumn="0" w:oddVBand="0" w:evenVBand="0" w:oddHBand="0" w:evenHBand="0" w:firstRowFirstColumn="0" w:firstRowLastColumn="0" w:lastRowFirstColumn="0" w:lastRowLastColumn="0"/>
+              <w:rPr>
+                <w:sz w:val="24"/>
+              </w:rPr>
+            </w:pPr>
+          </w:p>
+          <w:p>
+            <w:pPr>
+              <w:pStyle w:val="TableParagraph"/>
+              <w:cnfStyle w:val="000000000000" w:firstRow="0" w:lastRow="0" w:firstColumn="0" w:lastColumn="0" w:oddVBand="0" w:evenVBand="0" w:oddHBand="0" w:evenHBand="0" w:firstRowFirstColumn="0" w:firstRowLastColumn="0" w:lastRowFirstColumn="0" w:lastRowLastColumn="0"/>
+              <w:rPr>
+                <w:sz w:val="24"/>
+              </w:rPr>
+            </w:pPr>
+          </w:p>
+          <w:p>
+            <w:pPr>
+              <w:pStyle w:val="TableParagraph"/>
+              <w:numPr>
+                <w:ilvl w:val="0"/>
+                <w:numId w:val="20"/>
+              </w:numPr>
+              <w:cnfStyle w:val="000000000000" w:firstRow="0" w:lastRow="0" w:firstColumn="0" w:lastColumn="0" w:oddVBand="0" w:evenVBand="0" w:oddHBand="0" w:evenHBand="0" w:firstRowFirstColumn="0" w:firstRowLastColumn="0" w:lastRowFirstColumn="0" w:lastRowLastColumn="0"/>
+              <w:rPr>
+                <w:sz w:val="24"/>
+              </w:rPr>
+            </w:pPr>
+            <w:r>
+              <w:rPr>
+                <w:sz w:val="24"/>
+              </w:rPr>
+              <w:t xml:space="preserve">Updated logic in Messages Tab. </w:t>
+            </w:r>
+            <w:r>
+              <w:rPr>
+                <w:sz w:val="24"/>
+              </w:rPr>
+              <w:t xml:space="preserve">           </w:t>
+            </w:r>
+          </w:p>
+          <w:p>
+            <w:pPr>
+              <w:pStyle w:val="TableParagraph"/>
+              <w:numPr>
+                <w:ilvl w:val="0"/>
+                <w:numId w:val="24"/>
+              </w:numPr>
+              <w:cnfStyle w:val="000000000000" w:firstRow="0" w:lastRow="0" w:firstColumn="0" w:lastColumn="0" w:oddVBand="0" w:evenVBand="0" w:oddHBand="0" w:evenHBand="0" w:firstRowFirstColumn="0" w:firstRowLastColumn="0" w:lastRowFirstColumn="0" w:lastRowLastColumn="0"/>
+              <w:rPr>
+                <w:sz w:val="24"/>
+              </w:rPr>
+            </w:pPr>
+            <w:r>
+              <w:rPr>
+                <w:sz w:val="24"/>
+              </w:rPr>
+              <w:t>Admin can contact with doctor and receptionist and vice versa.</w:t>
+            </w:r>
+          </w:p>
+          <w:p>
+            <w:pPr>
+              <w:pStyle w:val="TableParagraph"/>
+              <w:numPr>
+                <w:ilvl w:val="0"/>
+                <w:numId w:val="24"/>
+              </w:numPr>
+              <w:cnfStyle w:val="000000000000" w:firstRow="0" w:lastRow="0" w:firstColumn="0" w:lastColumn="0" w:oddVBand="0" w:evenVBand="0" w:oddHBand="0" w:evenHBand="0" w:firstRowFirstColumn="0" w:firstRowLastColumn="0" w:lastRowFirstColumn="0" w:lastRowLastColumn="0"/>
+              <w:rPr>
+                <w:sz w:val="24"/>
+              </w:rPr>
+            </w:pPr>
+            <w:r>
+              <w:rPr>
+                <w:sz w:val="24"/>
+              </w:rPr>
+              <w:t xml:space="preserve">Doctor will have </w:t>
+            </w:r>
+            <w:proofErr w:type="gramStart"/>
+            <w:r>
+              <w:rPr>
+                <w:sz w:val="24"/>
+              </w:rPr>
+              <w:t>an</w:t>
+            </w:r>
+            <w:proofErr w:type="gramEnd"/>
+            <w:r>
+              <w:rPr>
+                <w:sz w:val="24"/>
+              </w:rPr>
+              <w:t xml:space="preserve"> functionality of adding his receptionist. Receptionist can chat with doctor assigned to it and the patients of that doctor. </w:t>
+            </w:r>
+          </w:p>
+          <w:p>
+            <w:pPr>
+              <w:pStyle w:val="TableParagraph"/>
+              <w:numPr>
+                <w:ilvl w:val="0"/>
+                <w:numId w:val="24"/>
+              </w:numPr>
+              <w:cnfStyle w:val="000000000000" w:firstRow="0" w:lastRow="0" w:firstColumn="0" w:lastColumn="0" w:oddVBand="0" w:evenVBand="0" w:oddHBand="0" w:evenHBand="0" w:firstRowFirstColumn="0" w:firstRowLastColumn="0" w:lastRowFirstColumn="0" w:lastRowLastColumn="0"/>
+              <w:rPr>
+                <w:sz w:val="24"/>
+              </w:rPr>
+            </w:pPr>
+            <w:r>
+              <w:rPr>
+                <w:sz w:val="24"/>
+              </w:rPr>
+              <w:t>Doctor with his patient and receptionist</w:t>
+            </w:r>
+          </w:p>
+          <w:p>
+            <w:pPr>
+              <w:pStyle w:val="TableParagraph"/>
+              <w:numPr>
+                <w:ilvl w:val="0"/>
+                <w:numId w:val="24"/>
+              </w:numPr>
+              <w:cnfStyle w:val="000000000000" w:firstRow="0" w:lastRow="0" w:firstColumn="0" w:lastColumn="0" w:oddVBand="0" w:evenVBand="0" w:oddHBand="0" w:evenHBand="0" w:firstRowFirstColumn="0" w:firstRowLastColumn="0" w:lastRowFirstColumn="0" w:lastRowLastColumn="0"/>
+              <w:rPr>
+                <w:sz w:val="24"/>
+              </w:rPr>
+            </w:pPr>
+            <w:r>
+              <w:rPr>
+                <w:sz w:val="24"/>
+              </w:rPr>
+              <w:t>Patient with his doctor and doctor’s receptionist.</w:t>
+            </w:r>
+          </w:p>
+          <w:p>
+            <w:pPr>
+              <w:pStyle w:val="TableParagraph"/>
+              <w:numPr>
+                <w:ilvl w:val="0"/>
+                <w:numId w:val="25"/>
+              </w:numPr>
+              <w:cnfStyle w:val="000000000000" w:firstRow="0" w:lastRow="0" w:firstColumn="0" w:lastColumn="0" w:oddVBand="0" w:evenVBand="0" w:oddHBand="0" w:evenHBand="0" w:firstRowFirstColumn="0" w:firstRowLastColumn="0" w:lastRowFirstColumn="0" w:lastRowLastColumn="0"/>
+              <w:rPr>
+                <w:sz w:val="24"/>
+              </w:rPr>
+            </w:pPr>
+            <w:r>
+              <w:rPr>
+                <w:sz w:val="24"/>
+              </w:rPr>
+              <w:t>Updated Profile Modal for doctor</w:t>
+            </w:r>
+          </w:p>
+          <w:p>
+            <w:pPr>
+              <w:pStyle w:val="TableParagraph"/>
+              <w:numPr>
+                <w:ilvl w:val="0"/>
+                <w:numId w:val="25"/>
+              </w:numPr>
+              <w:cnfStyle w:val="000000000000" w:firstRow="0" w:lastRow="0" w:firstColumn="0" w:lastColumn="0" w:oddVBand="0" w:evenVBand="0" w:oddHBand="0" w:evenHBand="0" w:firstRowFirstColumn="0" w:firstRowLastColumn="0" w:lastRowFirstColumn="0" w:lastRowLastColumn="0"/>
+              <w:rPr>
+                <w:sz w:val="24"/>
+              </w:rPr>
+            </w:pPr>
+            <w:r>
+              <w:rPr>
+                <w:sz w:val="24"/>
+              </w:rPr>
+              <w:t xml:space="preserve">Added React </w:t>
+            </w:r>
+            <w:proofErr w:type="spellStart"/>
+            <w:r>
+              <w:rPr>
+                <w:sz w:val="24"/>
+              </w:rPr>
+              <w:t>Toastify</w:t>
+            </w:r>
+            <w:proofErr w:type="spellEnd"/>
+            <w:r>
+              <w:rPr>
+                <w:sz w:val="24"/>
+              </w:rPr>
+              <w:t xml:space="preserve"> for Alert Messages</w:t>
+            </w:r>
+          </w:p>
+          <w:p>
+            <w:pPr>
+              <w:pStyle w:val="TableParagraph"/>
+              <w:ind w:left="720"/>
               <w:cnfStyle w:val="000000000000" w:firstRow="0" w:lastRow="0" w:firstColumn="0" w:lastColumn="0" w:oddVBand="0" w:evenVBand="0" w:oddHBand="0" w:evenHBand="0" w:firstRowFirstColumn="0" w:firstRowLastColumn="0" w:lastRowFirstColumn="0" w:lastRowLastColumn="0"/>
               <w:rPr>
                 <w:sz w:val="24"/>
@@ -12273,7 +12811,21 @@
               <w:rPr>
                 <w:sz w:val="24"/>
               </w:rPr>
-              <w:t xml:space="preserve">Added Notification Functionality. When an appointment is requested by the patient, notification is sent to doctor for doctor for approving the appointment. Doctor’s approval is communicated to patient through </w:t>
+              <w:t xml:space="preserve">Added Notification Functionality. When an appointment is requested by the patient, notification is sent to doctor for doctor for approving the appointment. Doctor’s approval </w:t>
+            </w:r>
+            <w:proofErr w:type="gramStart"/>
+            <w:r>
+              <w:rPr>
+                <w:sz w:val="24"/>
+              </w:rPr>
+              <w:t>is communicated</w:t>
+            </w:r>
+            <w:proofErr w:type="gramEnd"/>
+            <w:r>
+              <w:rPr>
+                <w:sz w:val="24"/>
+              </w:rPr>
+              <w:t xml:space="preserve"> to patient through </w:t>
             </w:r>
             <w:r>
               <w:rPr>
@@ -12285,7 +12837,35 @@
               <w:rPr>
                 <w:sz w:val="24"/>
               </w:rPr>
-              <w:t xml:space="preserve">. When a receptionist schedules an appointment for a patient notification is sent to doctor to notify of the appointment scheduled. The notifications can be clicked to mark as read in the dashboard panel </w:t>
+              <w:t xml:space="preserve">. When a receptionist schedules an appointment for a patient notification </w:t>
+            </w:r>
+            <w:proofErr w:type="gramStart"/>
+            <w:r>
+              <w:rPr>
+                <w:sz w:val="24"/>
+              </w:rPr>
+              <w:t>is sent</w:t>
+            </w:r>
+            <w:proofErr w:type="gramEnd"/>
+            <w:r>
+              <w:rPr>
+                <w:sz w:val="24"/>
+              </w:rPr>
+              <w:t xml:space="preserve"> to doctor to notify of the appointment scheduled. The notifications </w:t>
+            </w:r>
+            <w:proofErr w:type="gramStart"/>
+            <w:r>
+              <w:rPr>
+                <w:sz w:val="24"/>
+              </w:rPr>
+              <w:t>can be clicked</w:t>
+            </w:r>
+            <w:proofErr w:type="gramEnd"/>
+            <w:r>
+              <w:rPr>
+                <w:sz w:val="24"/>
+              </w:rPr>
+              <w:t xml:space="preserve"> to mark as read in the dashboard panel </w:t>
             </w:r>
             <w:r>
               <w:rPr>
@@ -12299,6 +12879,324 @@
               </w:rPr>
               <w:t>or each user.</w:t>
             </w:r>
+          </w:p>
+          <w:p>
+            <w:pPr>
+              <w:cnfStyle w:val="000000000000" w:firstRow="0" w:lastRow="0" w:firstColumn="0" w:lastColumn="0" w:oddVBand="0" w:evenVBand="0" w:oddHBand="0" w:evenHBand="0" w:firstRowFirstColumn="0" w:firstRowLastColumn="0" w:lastRowFirstColumn="0" w:lastRowLastColumn="0"/>
+            </w:pPr>
+          </w:p>
+          <w:p>
+            <w:pPr>
+              <w:cnfStyle w:val="000000000000" w:firstRow="0" w:lastRow="0" w:firstColumn="0" w:lastColumn="0" w:oddVBand="0" w:evenVBand="0" w:oddHBand="0" w:evenHBand="0" w:firstRowFirstColumn="0" w:firstRowLastColumn="0" w:lastRowFirstColumn="0" w:lastRowLastColumn="0"/>
+            </w:pPr>
+          </w:p>
+          <w:p>
+            <w:pPr>
+              <w:cnfStyle w:val="000000000000" w:firstRow="0" w:lastRow="0" w:firstColumn="0" w:lastColumn="0" w:oddVBand="0" w:evenVBand="0" w:oddHBand="0" w:evenHBand="0" w:firstRowFirstColumn="0" w:firstRowLastColumn="0" w:lastRowFirstColumn="0" w:lastRowLastColumn="0"/>
+            </w:pPr>
+          </w:p>
+          <w:p>
+            <w:pPr>
+              <w:cnfStyle w:val="000000000000" w:firstRow="0" w:lastRow="0" w:firstColumn="0" w:lastColumn="0" w:oddVBand="0" w:evenVBand="0" w:oddHBand="0" w:evenHBand="0" w:firstRowFirstColumn="0" w:firstRowLastColumn="0" w:lastRowFirstColumn="0" w:lastRowLastColumn="0"/>
+            </w:pPr>
+          </w:p>
+          <w:p>
+            <w:pPr>
+              <w:cnfStyle w:val="000000000000" w:firstRow="0" w:lastRow="0" w:firstColumn="0" w:lastColumn="0" w:oddVBand="0" w:evenVBand="0" w:oddHBand="0" w:evenHBand="0" w:firstRowFirstColumn="0" w:firstRowLastColumn="0" w:lastRowFirstColumn="0" w:lastRowLastColumn="0"/>
+            </w:pPr>
+          </w:p>
+          <w:p>
+            <w:pPr>
+              <w:cnfStyle w:val="000000000000" w:firstRow="0" w:lastRow="0" w:firstColumn="0" w:lastColumn="0" w:oddVBand="0" w:evenVBand="0" w:oddHBand="0" w:evenHBand="0" w:firstRowFirstColumn="0" w:firstRowLastColumn="0" w:lastRowFirstColumn="0" w:lastRowLastColumn="0"/>
+            </w:pPr>
+          </w:p>
+          <w:p>
+            <w:pPr>
+              <w:cnfStyle w:val="000000000000" w:firstRow="0" w:lastRow="0" w:firstColumn="0" w:lastColumn="0" w:oddVBand="0" w:evenVBand="0" w:oddHBand="0" w:evenHBand="0" w:firstRowFirstColumn="0" w:firstRowLastColumn="0" w:lastRowFirstColumn="0" w:lastRowLastColumn="0"/>
+            </w:pPr>
+          </w:p>
+          <w:p>
+            <w:pPr>
+              <w:cnfStyle w:val="000000000000" w:firstRow="0" w:lastRow="0" w:firstColumn="0" w:lastColumn="0" w:oddVBand="0" w:evenVBand="0" w:oddHBand="0" w:evenHBand="0" w:firstRowFirstColumn="0" w:firstRowLastColumn="0" w:lastRowFirstColumn="0" w:lastRowLastColumn="0"/>
+            </w:pPr>
+          </w:p>
+          <w:p>
+            <w:pPr>
+              <w:cnfStyle w:val="000000000000" w:firstRow="0" w:lastRow="0" w:firstColumn="0" w:lastColumn="0" w:oddVBand="0" w:evenVBand="0" w:oddHBand="0" w:evenHBand="0" w:firstRowFirstColumn="0" w:firstRowLastColumn="0" w:lastRowFirstColumn="0" w:lastRowLastColumn="0"/>
+            </w:pPr>
+          </w:p>
+          <w:p>
+            <w:pPr>
+              <w:cnfStyle w:val="000000000000" w:firstRow="0" w:lastRow="0" w:firstColumn="0" w:lastColumn="0" w:oddVBand="0" w:evenVBand="0" w:oddHBand="0" w:evenHBand="0" w:firstRowFirstColumn="0" w:firstRowLastColumn="0" w:lastRowFirstColumn="0" w:lastRowLastColumn="0"/>
+            </w:pPr>
+          </w:p>
+          <w:p>
+            <w:pPr>
+              <w:cnfStyle w:val="000000000000" w:firstRow="0" w:lastRow="0" w:firstColumn="0" w:lastColumn="0" w:oddVBand="0" w:evenVBand="0" w:oddHBand="0" w:evenHBand="0" w:firstRowFirstColumn="0" w:firstRowLastColumn="0" w:lastRowFirstColumn="0" w:lastRowLastColumn="0"/>
+            </w:pPr>
+          </w:p>
+          <w:p>
+            <w:pPr>
+              <w:cnfStyle w:val="000000000000" w:firstRow="0" w:lastRow="0" w:firstColumn="0" w:lastColumn="0" w:oddVBand="0" w:evenVBand="0" w:oddHBand="0" w:evenHBand="0" w:firstRowFirstColumn="0" w:firstRowLastColumn="0" w:lastRowFirstColumn="0" w:lastRowLastColumn="0"/>
+            </w:pPr>
+          </w:p>
+          <w:p>
+            <w:pPr>
+              <w:cnfStyle w:val="000000000000" w:firstRow="0" w:lastRow="0" w:firstColumn="0" w:lastColumn="0" w:oddVBand="0" w:evenVBand="0" w:oddHBand="0" w:evenHBand="0" w:firstRowFirstColumn="0" w:firstRowLastColumn="0" w:lastRowFirstColumn="0" w:lastRowLastColumn="0"/>
+            </w:pPr>
+          </w:p>
+          <w:p>
+            <w:pPr>
+              <w:cnfStyle w:val="000000000000" w:firstRow="0" w:lastRow="0" w:firstColumn="0" w:lastColumn="0" w:oddVBand="0" w:evenVBand="0" w:oddHBand="0" w:evenHBand="0" w:firstRowFirstColumn="0" w:firstRowLastColumn="0" w:lastRowFirstColumn="0" w:lastRowLastColumn="0"/>
+            </w:pPr>
+          </w:p>
+          <w:p>
+            <w:pPr>
+              <w:cnfStyle w:val="000000000000" w:firstRow="0" w:lastRow="0" w:firstColumn="0" w:lastColumn="0" w:oddVBand="0" w:evenVBand="0" w:oddHBand="0" w:evenHBand="0" w:firstRowFirstColumn="0" w:firstRowLastColumn="0" w:lastRowFirstColumn="0" w:lastRowLastColumn="0"/>
+            </w:pPr>
+          </w:p>
+          <w:p>
+            <w:pPr>
+              <w:cnfStyle w:val="000000000000" w:firstRow="0" w:lastRow="0" w:firstColumn="0" w:lastColumn="0" w:oddVBand="0" w:evenVBand="0" w:oddHBand="0" w:evenHBand="0" w:firstRowFirstColumn="0" w:firstRowLastColumn="0" w:lastRowFirstColumn="0" w:lastRowLastColumn="0"/>
+            </w:pPr>
+          </w:p>
+          <w:p>
+            <w:pPr>
+              <w:cnfStyle w:val="000000000000" w:firstRow="0" w:lastRow="0" w:firstColumn="0" w:lastColumn="0" w:oddVBand="0" w:evenVBand="0" w:oddHBand="0" w:evenHBand="0" w:firstRowFirstColumn="0" w:firstRowLastColumn="0" w:lastRowFirstColumn="0" w:lastRowLastColumn="0"/>
+            </w:pPr>
+          </w:p>
+          <w:p>
+            <w:pPr>
+              <w:ind w:firstLine="720"/>
+              <w:cnfStyle w:val="000000000000" w:firstRow="0" w:lastRow="0" w:firstColumn="0" w:lastColumn="0" w:oddVBand="0" w:evenVBand="0" w:oddHBand="0" w:evenHBand="0" w:firstRowFirstColumn="0" w:firstRowLastColumn="0" w:lastRowFirstColumn="0" w:lastRowLastColumn="0"/>
+            </w:pPr>
+          </w:p>
+          <w:p>
+            <w:pPr>
+              <w:ind w:firstLine="720"/>
+              <w:cnfStyle w:val="000000000000" w:firstRow="0" w:lastRow="0" w:firstColumn="0" w:lastColumn="0" w:oddVBand="0" w:evenVBand="0" w:oddHBand="0" w:evenHBand="0" w:firstRowFirstColumn="0" w:firstRowLastColumn="0" w:lastRowFirstColumn="0" w:lastRowLastColumn="0"/>
+            </w:pPr>
+          </w:p>
+          <w:p>
+            <w:pPr>
+              <w:pStyle w:val="ListParagraph"/>
+              <w:numPr>
+                <w:ilvl w:val="0"/>
+                <w:numId w:val="20"/>
+              </w:numPr>
+              <w:cnfStyle w:val="000000000000" w:firstRow="0" w:lastRow="0" w:firstColumn="0" w:lastColumn="0" w:oddVBand="0" w:evenVBand="0" w:oddHBand="0" w:evenHBand="0" w:firstRowFirstColumn="0" w:firstRowLastColumn="0" w:lastRowFirstColumn="0" w:lastRowLastColumn="0"/>
+            </w:pPr>
+            <w:r>
+              <w:t xml:space="preserve">Fixed a bug in notifications modal where cancel notification </w:t>
+            </w:r>
+            <w:proofErr w:type="gramStart"/>
+            <w:r>
+              <w:t>wasn’t</w:t>
+            </w:r>
+            <w:proofErr w:type="gramEnd"/>
+            <w:r>
+              <w:t xml:space="preserve"> sent.</w:t>
+            </w:r>
+          </w:p>
+          <w:p>
+            <w:pPr>
+              <w:pStyle w:val="ListParagraph"/>
+              <w:numPr>
+                <w:ilvl w:val="0"/>
+                <w:numId w:val="20"/>
+              </w:numPr>
+              <w:cnfStyle w:val="000000000000" w:firstRow="0" w:lastRow="0" w:firstColumn="0" w:lastColumn="0" w:oddVBand="0" w:evenVBand="0" w:oddHBand="0" w:evenHBand="0" w:firstRowFirstColumn="0" w:firstRowLastColumn="0" w:lastRowFirstColumn="0" w:lastRowLastColumn="0"/>
+            </w:pPr>
+            <w:r>
+              <w:rPr>
+                <w:color w:val="000000" w:themeColor="text1"/>
+              </w:rPr>
+              <w:t xml:space="preserve">Fixed Patient Info fetch and edit in </w:t>
+            </w:r>
+            <w:r>
+              <w:rPr>
+                <w:color w:val="000000" w:themeColor="text1"/>
+              </w:rPr>
+              <w:t xml:space="preserve"> receptionist </w:t>
+            </w:r>
+            <w:r>
+              <w:rPr>
+                <w:color w:val="000000" w:themeColor="text1"/>
+              </w:rPr>
+              <w:t>dashboard</w:t>
+            </w:r>
+          </w:p>
+        </w:tc>
+      </w:tr>
+      <w:tr>
+        <w:trPr>
+          <w:cnfStyle w:val="000000100000" w:firstRow="0" w:lastRow="0" w:firstColumn="0" w:lastColumn="0" w:oddVBand="0" w:evenVBand="0" w:oddHBand="1" w:evenHBand="0" w:firstRowFirstColumn="0" w:firstRowLastColumn="0" w:lastRowFirstColumn="0" w:lastRowLastColumn="0"/>
+          <w:trHeight w:val="1875"/>
+        </w:trPr>
+        <w:tc>
+          <w:tcPr>
+            <w:cnfStyle w:val="001000000000" w:firstRow="0" w:lastRow="0" w:firstColumn="1" w:lastColumn="0" w:oddVBand="0" w:evenVBand="0" w:oddHBand="0" w:evenHBand="0" w:firstRowFirstColumn="0" w:firstRowLastColumn="0" w:lastRowFirstColumn="0" w:lastRowLastColumn="0"/>
+            <w:tcW w:w="3070" w:type="dxa"/>
+          </w:tcPr>
+          <w:p>
+            <w:pPr>
+              <w:pStyle w:val="TableParagraph"/>
+              <w:ind w:left="87" w:right="164"/>
+              <w:jc w:val="center"/>
+              <w:rPr>
+                <w:color w:val="FFFFFF"/>
+              </w:rPr>
+            </w:pPr>
+          </w:p>
+          <w:p>
+            <w:pPr>
+              <w:pStyle w:val="TableParagraph"/>
+              <w:ind w:left="87" w:right="164"/>
+              <w:jc w:val="center"/>
+              <w:rPr>
+                <w:color w:val="FFFFFF"/>
+              </w:rPr>
+            </w:pPr>
+          </w:p>
+          <w:p>
+            <w:pPr>
+              <w:pStyle w:val="TableParagraph"/>
+              <w:ind w:left="87" w:right="164"/>
+              <w:jc w:val="center"/>
+              <w:rPr>
+                <w:b w:val="0"/>
+              </w:rPr>
+            </w:pPr>
+            <w:r>
+              <w:rPr>
+                <w:color w:val="FFFFFF"/>
+              </w:rPr>
+              <w:t>[Week</w:t>
+            </w:r>
+            <w:r>
+              <w:rPr>
+                <w:color w:val="FFFFFF"/>
+                <w:spacing w:val="-10"/>
+              </w:rPr>
+              <w:t xml:space="preserve"> </w:t>
+            </w:r>
+            <w:r>
+              <w:rPr>
+                <w:color w:val="FFFFFF"/>
+                <w:spacing w:val="-5"/>
+              </w:rPr>
+              <w:t>03</w:t>
+            </w:r>
+            <w:r>
+              <w:rPr>
+                <w:color w:val="FFFFFF"/>
+                <w:spacing w:val="-5"/>
+              </w:rPr>
+              <w:t>]</w:t>
+            </w:r>
+          </w:p>
+          <w:p>
+            <w:pPr>
+              <w:pStyle w:val="TableParagraph"/>
+              <w:rPr>
+                <w:sz w:val="24"/>
+              </w:rPr>
+            </w:pPr>
+            <w:r>
+              <w:rPr>
+                <w:color w:val="FFFFFF"/>
+              </w:rPr>
+              <w:t xml:space="preserve">      16</w:t>
+            </w:r>
+            <w:r>
+              <w:rPr>
+                <w:color w:val="FFFFFF"/>
+              </w:rPr>
+              <w:t>-Feb-2026</w:t>
+            </w:r>
+            <w:r>
+              <w:rPr>
+                <w:color w:val="FFFFFF"/>
+                <w:spacing w:val="-8"/>
+              </w:rPr>
+              <w:t xml:space="preserve"> </w:t>
+            </w:r>
+            <w:r>
+              <w:rPr>
+                <w:color w:val="FFFFFF"/>
+              </w:rPr>
+              <w:t>-</w:t>
+            </w:r>
+            <w:r>
+              <w:rPr>
+                <w:color w:val="FFFFFF"/>
+                <w:spacing w:val="-10"/>
+              </w:rPr>
+              <w:t xml:space="preserve"> </w:t>
+            </w:r>
+            <w:r>
+              <w:rPr>
+                <w:color w:val="FFFFFF"/>
+              </w:rPr>
+              <w:t>22</w:t>
+            </w:r>
+            <w:bookmarkStart w:id="0" w:name="_GoBack"/>
+            <w:bookmarkEnd w:id="0"/>
+            <w:r>
+              <w:rPr>
+                <w:color w:val="FFFFFF"/>
+                <w:spacing w:val="-7"/>
+              </w:rPr>
+              <w:t xml:space="preserve"> </w:t>
+            </w:r>
+            <w:r>
+              <w:rPr>
+                <w:color w:val="FFFFFF"/>
+              </w:rPr>
+              <w:t>Feb</w:t>
+            </w:r>
+            <w:r>
+              <w:rPr>
+                <w:color w:val="FFFFFF"/>
+                <w:spacing w:val="-7"/>
+              </w:rPr>
+              <w:t xml:space="preserve"> </w:t>
+            </w:r>
+            <w:r>
+              <w:rPr>
+                <w:color w:val="FFFFFF"/>
+                <w:spacing w:val="-4"/>
+              </w:rPr>
+              <w:t>2026</w:t>
+            </w:r>
+          </w:p>
+        </w:tc>
+        <w:tc>
+          <w:tcPr>
+            <w:tcW w:w="4230" w:type="dxa"/>
+          </w:tcPr>
+          <w:p>
+            <w:pPr>
+              <w:pStyle w:val="TableParagraph"/>
+              <w:cnfStyle w:val="000000100000" w:firstRow="0" w:lastRow="0" w:firstColumn="0" w:lastColumn="0" w:oddVBand="0" w:evenVBand="0" w:oddHBand="1" w:evenHBand="0" w:firstRowFirstColumn="0" w:firstRowLastColumn="0" w:lastRowFirstColumn="0" w:lastRowLastColumn="0"/>
+              <w:rPr>
+                <w:sz w:val="24"/>
+              </w:rPr>
+            </w:pPr>
+          </w:p>
+        </w:tc>
+        <w:tc>
+          <w:tcPr>
+            <w:tcW w:w="3850" w:type="dxa"/>
+          </w:tcPr>
+          <w:p>
+            <w:pPr>
+              <w:pStyle w:val="TableParagraph"/>
+              <w:cnfStyle w:val="000000100000" w:firstRow="0" w:lastRow="0" w:firstColumn="0" w:lastColumn="0" w:oddVBand="0" w:evenVBand="0" w:oddHBand="1" w:evenHBand="0" w:firstRowFirstColumn="0" w:firstRowLastColumn="0" w:lastRowFirstColumn="0" w:lastRowLastColumn="0"/>
+              <w:rPr>
+                <w:sz w:val="24"/>
+              </w:rPr>
+            </w:pPr>
           </w:p>
         </w:tc>
       </w:tr>
@@ -12379,7 +13277,7 @@
               </wp:anchor>
             </w:drawing>
           </mc:Choice>
-          <mc:Fallback xmlns:w16sdtfl="http://schemas.microsoft.com/office/word/2024/wordml/sdtformatlock" xmlns:w16sdtdh="http://schemas.microsoft.com/office/word/2020/wordml/sdtdatahash" xmlns:w16du="http://schemas.microsoft.com/office/word/2023/wordml/word16du" xmlns:w16="http://schemas.microsoft.com/office/word/2018/wordml" xmlns:w16cid="http://schemas.microsoft.com/office/word/2016/wordml/cid" xmlns:w16cex="http://schemas.microsoft.com/office/word/2018/wordml/cex" xmlns:oel="http://schemas.microsoft.com/office/2019/extlst" xmlns:am3d="http://schemas.microsoft.com/office/drawing/2017/model3d" xmlns:aink="http://schemas.microsoft.com/office/drawing/2016/ink" xmlns:cx8="http://schemas.microsoft.com/office/drawing/2016/5/14/chartex" xmlns:cx7="http://schemas.microsoft.com/office/drawing/2016/5/13/chartex" xmlns:cx6="http://schemas.microsoft.com/office/drawing/2016/5/12/chartex" xmlns:cx5="http://schemas.microsoft.com/office/drawing/2016/5/11/chartex" xmlns:cx4="http://schemas.microsoft.com/office/drawing/2016/5/10/chartex" xmlns:cx3="http://schemas.microsoft.com/office/drawing/2016/5/9/chartex" xmlns:cx2="http://schemas.microsoft.com/office/drawing/2015/10/21/chartex">
+          <mc:Fallback>
             <w:pict>
               <v:shape w14:anchorId="30363CFD" id="_x0000_s1027" type="#_x0000_t202" style="position:absolute;margin-left:46.4pt;margin-top:148.1pt;width:536.4pt;height:714.2pt;z-index:251661312;visibility:visible;mso-wrap-style:square;mso-wrap-distance-left:0;mso-wrap-distance-top:0;mso-wrap-distance-right:0;mso-wrap-distance-bottom:0;mso-position-horizontal:absolute;mso-position-horizontal-relative:page;mso-position-vertical:absolute;mso-position-vertical-relative:page;v-text-anchor:top" o:gfxdata="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" filled="f" stroked="f">
                 <v:path arrowok="t"/>
@@ -13610,6 +14508,119 @@
     </w:lvl>
   </w:abstractNum>
   <w:abstractNum w:abstractNumId="10" w15:restartNumberingAfterBreak="0">
+    <w:nsid w:val="3A772EF1"/>
+    <w:multiLevelType w:val="hybridMultilevel"/>
+    <w:tmpl w:val="18E8FC6E"/>
+    <w:lvl w:ilvl="0" w:tplc="04090001">
+      <w:start w:val="1"/>
+      <w:numFmt w:val="bullet"/>
+      <w:lvlText w:val=""/>
+      <w:lvlJc w:val="left"/>
+      <w:pPr>
+        <w:ind w:left="720" w:hanging="360"/>
+      </w:pPr>
+      <w:rPr>
+        <w:rFonts w:ascii="Symbol" w:hAnsi="Symbol" w:hint="default"/>
+      </w:rPr>
+    </w:lvl>
+    <w:lvl w:ilvl="1" w:tplc="04090003" w:tentative="1">
+      <w:start w:val="1"/>
+      <w:numFmt w:val="bullet"/>
+      <w:lvlText w:val="o"/>
+      <w:lvlJc w:val="left"/>
+      <w:pPr>
+        <w:ind w:left="1440" w:hanging="360"/>
+      </w:pPr>
+      <w:rPr>
+        <w:rFonts w:ascii="Courier New" w:hAnsi="Courier New" w:cs="Courier New" w:hint="default"/>
+      </w:rPr>
+    </w:lvl>
+    <w:lvl w:ilvl="2" w:tplc="04090005" w:tentative="1">
+      <w:start w:val="1"/>
+      <w:numFmt w:val="bullet"/>
+      <w:lvlText w:val=""/>
+      <w:lvlJc w:val="left"/>
+      <w:pPr>
+        <w:ind w:left="2160" w:hanging="360"/>
+      </w:pPr>
+      <w:rPr>
+        <w:rFonts w:ascii="Wingdings" w:hAnsi="Wingdings" w:hint="default"/>
+      </w:rPr>
+    </w:lvl>
+    <w:lvl w:ilvl="3" w:tplc="04090001" w:tentative="1">
+      <w:start w:val="1"/>
+      <w:numFmt w:val="bullet"/>
+      <w:lvlText w:val=""/>
+      <w:lvlJc w:val="left"/>
+      <w:pPr>
+        <w:ind w:left="2880" w:hanging="360"/>
+      </w:pPr>
+      <w:rPr>
+        <w:rFonts w:ascii="Symbol" w:hAnsi="Symbol" w:hint="default"/>
+      </w:rPr>
+    </w:lvl>
+    <w:lvl w:ilvl="4" w:tplc="04090003" w:tentative="1">
+      <w:start w:val="1"/>
+      <w:numFmt w:val="bullet"/>
+      <w:lvlText w:val="o"/>
+      <w:lvlJc w:val="left"/>
+      <w:pPr>
+        <w:ind w:left="3600" w:hanging="360"/>
+      </w:pPr>
+      <w:rPr>
+        <w:rFonts w:ascii="Courier New" w:hAnsi="Courier New" w:cs="Courier New" w:hint="default"/>
+      </w:rPr>
+    </w:lvl>
+    <w:lvl w:ilvl="5" w:tplc="04090005" w:tentative="1">
+      <w:start w:val="1"/>
+      <w:numFmt w:val="bullet"/>
+      <w:lvlText w:val=""/>
+      <w:lvlJc w:val="left"/>
+      <w:pPr>
+        <w:ind w:left="4320" w:hanging="360"/>
+      </w:pPr>
+      <w:rPr>
+        <w:rFonts w:ascii="Wingdings" w:hAnsi="Wingdings" w:hint="default"/>
+      </w:rPr>
+    </w:lvl>
+    <w:lvl w:ilvl="6" w:tplc="04090001" w:tentative="1">
+      <w:start w:val="1"/>
+      <w:numFmt w:val="bullet"/>
+      <w:lvlText w:val=""/>
+      <w:lvlJc w:val="left"/>
+      <w:pPr>
+        <w:ind w:left="5040" w:hanging="360"/>
+      </w:pPr>
+      <w:rPr>
+        <w:rFonts w:ascii="Symbol" w:hAnsi="Symbol" w:hint="default"/>
+      </w:rPr>
+    </w:lvl>
+    <w:lvl w:ilvl="7" w:tplc="04090003" w:tentative="1">
+      <w:start w:val="1"/>
+      <w:numFmt w:val="bullet"/>
+      <w:lvlText w:val="o"/>
+      <w:lvlJc w:val="left"/>
+      <w:pPr>
+        <w:ind w:left="5760" w:hanging="360"/>
+      </w:pPr>
+      <w:rPr>
+        <w:rFonts w:ascii="Courier New" w:hAnsi="Courier New" w:cs="Courier New" w:hint="default"/>
+      </w:rPr>
+    </w:lvl>
+    <w:lvl w:ilvl="8" w:tplc="04090005" w:tentative="1">
+      <w:start w:val="1"/>
+      <w:numFmt w:val="bullet"/>
+      <w:lvlText w:val=""/>
+      <w:lvlJc w:val="left"/>
+      <w:pPr>
+        <w:ind w:left="6480" w:hanging="360"/>
+      </w:pPr>
+      <w:rPr>
+        <w:rFonts w:ascii="Wingdings" w:hAnsi="Wingdings" w:hint="default"/>
+      </w:rPr>
+    </w:lvl>
+  </w:abstractNum>
+  <w:abstractNum w:abstractNumId="11" w15:restartNumberingAfterBreak="0">
     <w:nsid w:val="40583A40"/>
     <w:multiLevelType w:val="hybridMultilevel"/>
     <w:tmpl w:val="C90A266E"/>
@@ -13730,7 +14741,7 @@
       </w:rPr>
     </w:lvl>
   </w:abstractNum>
-  <w:abstractNum w:abstractNumId="11" w15:restartNumberingAfterBreak="0">
+  <w:abstractNum w:abstractNumId="12" w15:restartNumberingAfterBreak="0">
     <w:nsid w:val="41924CDD"/>
     <w:multiLevelType w:val="hybridMultilevel"/>
     <w:tmpl w:val="E59AF380"/>
@@ -13860,7 +14871,7 @@
       </w:rPr>
     </w:lvl>
   </w:abstractNum>
-  <w:abstractNum w:abstractNumId="12" w15:restartNumberingAfterBreak="0">
+  <w:abstractNum w:abstractNumId="13" w15:restartNumberingAfterBreak="0">
     <w:nsid w:val="45DE295F"/>
     <w:multiLevelType w:val="hybridMultilevel"/>
     <w:tmpl w:val="D96EE39A"/>
@@ -13981,7 +14992,7 @@
       </w:rPr>
     </w:lvl>
   </w:abstractNum>
-  <w:abstractNum w:abstractNumId="13" w15:restartNumberingAfterBreak="0">
+  <w:abstractNum w:abstractNumId="14" w15:restartNumberingAfterBreak="0">
     <w:nsid w:val="477B0CB2"/>
     <w:multiLevelType w:val="hybridMultilevel"/>
     <w:tmpl w:val="7C0440E4"/>
@@ -14094,7 +15105,7 @@
       </w:rPr>
     </w:lvl>
   </w:abstractNum>
-  <w:abstractNum w:abstractNumId="14" w15:restartNumberingAfterBreak="0">
+  <w:abstractNum w:abstractNumId="15" w15:restartNumberingAfterBreak="0">
     <w:nsid w:val="47832B5E"/>
     <w:multiLevelType w:val="hybridMultilevel"/>
     <w:tmpl w:val="002CEB40"/>
@@ -14215,7 +15226,7 @@
       </w:rPr>
     </w:lvl>
   </w:abstractNum>
-  <w:abstractNum w:abstractNumId="15" w15:restartNumberingAfterBreak="0">
+  <w:abstractNum w:abstractNumId="16" w15:restartNumberingAfterBreak="0">
     <w:nsid w:val="53024D4A"/>
     <w:multiLevelType w:val="hybridMultilevel"/>
     <w:tmpl w:val="90E2B54C"/>
@@ -14330,7 +15341,7 @@
       </w:rPr>
     </w:lvl>
   </w:abstractNum>
-  <w:abstractNum w:abstractNumId="16" w15:restartNumberingAfterBreak="0">
+  <w:abstractNum w:abstractNumId="17" w15:restartNumberingAfterBreak="0">
     <w:nsid w:val="53B34DCD"/>
     <w:multiLevelType w:val="hybridMultilevel"/>
     <w:tmpl w:val="D298B1F8"/>
@@ -14451,7 +15462,7 @@
       </w:rPr>
     </w:lvl>
   </w:abstractNum>
-  <w:abstractNum w:abstractNumId="17" w15:restartNumberingAfterBreak="0">
+  <w:abstractNum w:abstractNumId="18" w15:restartNumberingAfterBreak="0">
     <w:nsid w:val="57661EB7"/>
     <w:multiLevelType w:val="hybridMultilevel"/>
     <w:tmpl w:val="BCA8FCB8"/>
@@ -14563,7 +15574,7 @@
       </w:rPr>
     </w:lvl>
   </w:abstractNum>
-  <w:abstractNum w:abstractNumId="18" w15:restartNumberingAfterBreak="0">
+  <w:abstractNum w:abstractNumId="19" w15:restartNumberingAfterBreak="0">
     <w:nsid w:val="5BE224CC"/>
     <w:multiLevelType w:val="hybridMultilevel"/>
     <w:tmpl w:val="DA266992"/>
@@ -14684,7 +15695,7 @@
       </w:rPr>
     </w:lvl>
   </w:abstractNum>
-  <w:abstractNum w:abstractNumId="19" w15:restartNumberingAfterBreak="0">
+  <w:abstractNum w:abstractNumId="20" w15:restartNumberingAfterBreak="0">
     <w:nsid w:val="5C2E1F7B"/>
     <w:multiLevelType w:val="hybridMultilevel"/>
     <w:tmpl w:val="179C28D6"/>
@@ -14796,7 +15807,7 @@
       </w:rPr>
     </w:lvl>
   </w:abstractNum>
-  <w:abstractNum w:abstractNumId="20" w15:restartNumberingAfterBreak="0">
+  <w:abstractNum w:abstractNumId="21" w15:restartNumberingAfterBreak="0">
     <w:nsid w:val="6A2567D1"/>
     <w:multiLevelType w:val="hybridMultilevel"/>
     <w:tmpl w:val="0A940ABA"/>
@@ -14909,10 +15920,10 @@
       </w:rPr>
     </w:lvl>
   </w:abstractNum>
-  <w:abstractNum w:abstractNumId="21" w15:restartNumberingAfterBreak="0">
+  <w:abstractNum w:abstractNumId="22" w15:restartNumberingAfterBreak="0">
     <w:nsid w:val="6EE9341A"/>
     <w:multiLevelType w:val="hybridMultilevel"/>
-    <w:tmpl w:val="C8A87A30"/>
+    <w:tmpl w:val="2702F85C"/>
     <w:lvl w:ilvl="0" w:tplc="04090001">
       <w:start w:val="1"/>
       <w:numFmt w:val="bullet"/>
@@ -15022,7 +16033,7 @@
       </w:rPr>
     </w:lvl>
   </w:abstractNum>
-  <w:abstractNum w:abstractNumId="22" w15:restartNumberingAfterBreak="0">
+  <w:abstractNum w:abstractNumId="23" w15:restartNumberingAfterBreak="0">
     <w:nsid w:val="78912B40"/>
     <w:multiLevelType w:val="hybridMultilevel"/>
     <w:tmpl w:val="EC123714"/>
@@ -15143,20 +16154,106 @@
       </w:rPr>
     </w:lvl>
   </w:abstractNum>
+  <w:abstractNum w:abstractNumId="24" w15:restartNumberingAfterBreak="0">
+    <w:nsid w:val="7B1E6F82"/>
+    <w:multiLevelType w:val="hybridMultilevel"/>
+    <w:tmpl w:val="609A7632"/>
+    <w:lvl w:ilvl="0" w:tplc="0809000F">
+      <w:start w:val="1"/>
+      <w:numFmt w:val="decimal"/>
+      <w:lvlText w:val="%1."/>
+      <w:lvlJc w:val="left"/>
+      <w:pPr>
+        <w:ind w:left="1440" w:hanging="360"/>
+      </w:pPr>
+    </w:lvl>
+    <w:lvl w:ilvl="1" w:tplc="04090019" w:tentative="1">
+      <w:start w:val="1"/>
+      <w:numFmt w:val="lowerLetter"/>
+      <w:lvlText w:val="%2."/>
+      <w:lvlJc w:val="left"/>
+      <w:pPr>
+        <w:ind w:left="2160" w:hanging="360"/>
+      </w:pPr>
+    </w:lvl>
+    <w:lvl w:ilvl="2" w:tplc="0409001B" w:tentative="1">
+      <w:start w:val="1"/>
+      <w:numFmt w:val="lowerRoman"/>
+      <w:lvlText w:val="%3."/>
+      <w:lvlJc w:val="right"/>
+      <w:pPr>
+        <w:ind w:left="2880" w:hanging="180"/>
+      </w:pPr>
+    </w:lvl>
+    <w:lvl w:ilvl="3" w:tplc="0409000F" w:tentative="1">
+      <w:start w:val="1"/>
+      <w:numFmt w:val="decimal"/>
+      <w:lvlText w:val="%4."/>
+      <w:lvlJc w:val="left"/>
+      <w:pPr>
+        <w:ind w:left="3600" w:hanging="360"/>
+      </w:pPr>
+    </w:lvl>
+    <w:lvl w:ilvl="4" w:tplc="04090019" w:tentative="1">
+      <w:start w:val="1"/>
+      <w:numFmt w:val="lowerLetter"/>
+      <w:lvlText w:val="%5."/>
+      <w:lvlJc w:val="left"/>
+      <w:pPr>
+        <w:ind w:left="4320" w:hanging="360"/>
+      </w:pPr>
+    </w:lvl>
+    <w:lvl w:ilvl="5" w:tplc="0409001B" w:tentative="1">
+      <w:start w:val="1"/>
+      <w:numFmt w:val="lowerRoman"/>
+      <w:lvlText w:val="%6."/>
+      <w:lvlJc w:val="right"/>
+      <w:pPr>
+        <w:ind w:left="5040" w:hanging="180"/>
+      </w:pPr>
+    </w:lvl>
+    <w:lvl w:ilvl="6" w:tplc="0409000F" w:tentative="1">
+      <w:start w:val="1"/>
+      <w:numFmt w:val="decimal"/>
+      <w:lvlText w:val="%7."/>
+      <w:lvlJc w:val="left"/>
+      <w:pPr>
+        <w:ind w:left="5760" w:hanging="360"/>
+      </w:pPr>
+    </w:lvl>
+    <w:lvl w:ilvl="7" w:tplc="04090019" w:tentative="1">
+      <w:start w:val="1"/>
+      <w:numFmt w:val="lowerLetter"/>
+      <w:lvlText w:val="%8."/>
+      <w:lvlJc w:val="left"/>
+      <w:pPr>
+        <w:ind w:left="6480" w:hanging="360"/>
+      </w:pPr>
+    </w:lvl>
+    <w:lvl w:ilvl="8" w:tplc="0409001B" w:tentative="1">
+      <w:start w:val="1"/>
+      <w:numFmt w:val="lowerRoman"/>
+      <w:lvlText w:val="%9."/>
+      <w:lvlJc w:val="right"/>
+      <w:pPr>
+        <w:ind w:left="7200" w:hanging="180"/>
+      </w:pPr>
+    </w:lvl>
+  </w:abstractNum>
   <w:num w:numId="1">
     <w:abstractNumId w:val="1"/>
   </w:num>
   <w:num w:numId="2">
-    <w:abstractNumId w:val="15"/>
+    <w:abstractNumId w:val="16"/>
   </w:num>
   <w:num w:numId="3">
     <w:abstractNumId w:val="9"/>
   </w:num>
   <w:num w:numId="4">
-    <w:abstractNumId w:val="12"/>
+    <w:abstractNumId w:val="13"/>
   </w:num>
   <w:num w:numId="5">
-    <w:abstractNumId w:val="16"/>
+    <w:abstractNumId w:val="17"/>
   </w:num>
   <w:num w:numId="6">
     <w:abstractNumId w:val="3"/>
@@ -15168,19 +16265,19 @@
     <w:abstractNumId w:val="4"/>
   </w:num>
   <w:num w:numId="9">
-    <w:abstractNumId w:val="10"/>
+    <w:abstractNumId w:val="11"/>
   </w:num>
   <w:num w:numId="10">
-    <w:abstractNumId w:val="11"/>
+    <w:abstractNumId w:val="12"/>
   </w:num>
   <w:num w:numId="11">
     <w:abstractNumId w:val="7"/>
   </w:num>
   <w:num w:numId="12">
-    <w:abstractNumId w:val="18"/>
+    <w:abstractNumId w:val="19"/>
   </w:num>
   <w:num w:numId="13">
-    <w:abstractNumId w:val="22"/>
+    <w:abstractNumId w:val="23"/>
   </w:num>
   <w:num w:numId="14">
     <w:abstractNumId w:val="6"/>
@@ -15192,25 +16289,31 @@
     <w:abstractNumId w:val="2"/>
   </w:num>
   <w:num w:numId="17">
+    <w:abstractNumId w:val="15"/>
+  </w:num>
+  <w:num w:numId="18">
+    <w:abstractNumId w:val="21"/>
+  </w:num>
+  <w:num w:numId="19">
     <w:abstractNumId w:val="14"/>
   </w:num>
-  <w:num w:numId="18">
+  <w:num w:numId="20">
+    <w:abstractNumId w:val="22"/>
+  </w:num>
+  <w:num w:numId="21">
     <w:abstractNumId w:val="20"/>
   </w:num>
-  <w:num w:numId="19">
-    <w:abstractNumId w:val="13"/>
-  </w:num>
-  <w:num w:numId="20">
-    <w:abstractNumId w:val="21"/>
-  </w:num>
-  <w:num w:numId="21">
-    <w:abstractNumId w:val="19"/>
-  </w:num>
   <w:num w:numId="22">
-    <w:abstractNumId w:val="17"/>
+    <w:abstractNumId w:val="18"/>
   </w:num>
   <w:num w:numId="23">
     <w:abstractNumId w:val="0"/>
+  </w:num>
+  <w:num w:numId="24">
+    <w:abstractNumId w:val="24"/>
+  </w:num>
+  <w:num w:numId="25">
+    <w:abstractNumId w:val="10"/>
   </w:num>
 </w:numbering>
 </file>
@@ -15843,6 +16946,17 @@
       </w:tcPr>
     </w:tblStylePr>
   </w:style>
+  <w:style w:type="paragraph" w:styleId="ListParagraph">
+    <w:name w:val="List Paragraph"/>
+    <w:basedOn w:val="Normal"/>
+    <w:uiPriority w:val="34"/>
+    <w:qFormat/>
+    <w:rsid w:val="00793AC2"/>
+    <w:pPr>
+      <w:ind w:left="720"/>
+      <w:contextualSpacing/>
+    </w:pPr>
+  </w:style>
 </w:styles>
 </file>
 
@@ -16146,7 +17260,7 @@
 </file>
 
 <file path=customXml/itemProps1.xml><?xml version="1.0" encoding="utf-8"?>
-<ds:datastoreItem xmlns:ds="http://schemas.openxmlformats.org/officeDocument/2006/customXml" ds:itemID="{F05D9877-388B-4267-94E0-CCA4614C3976}">
+<ds:datastoreItem xmlns:ds="http://schemas.openxmlformats.org/officeDocument/2006/customXml" ds:itemID="{99CE3EA4-1E3D-4561-BFDA-CB1EF5EE87A3}">
   <ds:schemaRefs>
     <ds:schemaRef ds:uri="http://schemas.openxmlformats.org/officeDocument/2006/bibliography"/>
   </ds:schemaRefs>

</xml_diff>

<commit_message>
Update Week 04 CP-2
</commit_message>
<xml_diff>
--- a/Weekly Progress Report/weekly-progress-report.docx
+++ b/Weekly Progress Report/weekly-progress-report.docx
@@ -10710,21 +10710,7 @@
               <w:rPr>
                 <w:sz w:val="24"/>
               </w:rPr>
-              <w:t xml:space="preserve">On register page. If the user has </w:t>
-            </w:r>
-            <w:proofErr w:type="gramStart"/>
-            <w:r>
-              <w:rPr>
-                <w:sz w:val="24"/>
-              </w:rPr>
-              <w:t>registered</w:t>
-            </w:r>
-            <w:proofErr w:type="gramEnd"/>
-            <w:r>
-              <w:rPr>
-                <w:sz w:val="24"/>
-              </w:rPr>
-              <w:t xml:space="preserve"> he have to activate his account </w:t>
+              <w:t xml:space="preserve">On register page. If the user has registered he have to activate his account </w:t>
             </w:r>
             <w:r>
               <w:rPr>
@@ -10760,21 +10746,7 @@
               <w:rPr>
                 <w:sz w:val="24"/>
               </w:rPr>
-              <w:t xml:space="preserve">As user </w:t>
-            </w:r>
-            <w:proofErr w:type="gramStart"/>
-            <w:r>
-              <w:rPr>
-                <w:sz w:val="24"/>
-              </w:rPr>
-              <w:t>logins</w:t>
-            </w:r>
-            <w:proofErr w:type="gramEnd"/>
-            <w:r>
-              <w:rPr>
-                <w:sz w:val="24"/>
-              </w:rPr>
-              <w:t xml:space="preserve"> it</w:t>
+              <w:t>As user logins it</w:t>
             </w:r>
             <w:r>
               <w:rPr>
@@ -10839,19 +10811,11 @@
                 <w:sz w:val="24"/>
               </w:rPr>
             </w:pPr>
-            <w:proofErr w:type="gramStart"/>
-            <w:r>
-              <w:rPr>
-                <w:sz w:val="24"/>
-              </w:rPr>
-              <w:t>So</w:t>
-            </w:r>
-            <w:proofErr w:type="gramEnd"/>
-            <w:r>
-              <w:rPr>
-                <w:sz w:val="24"/>
-              </w:rPr>
-              <w:t xml:space="preserve"> the users can message each other</w:t>
+            <w:r>
+              <w:rPr>
+                <w:sz w:val="24"/>
+              </w:rPr>
+              <w:t>So the users can message each other</w:t>
             </w:r>
             <w:r>
               <w:rPr>
@@ -10877,19 +10841,11 @@
               </w:rPr>
               <w:t xml:space="preserve">Also added Notification component in the Dashboards headers. For </w:t>
             </w:r>
-            <w:proofErr w:type="gramStart"/>
-            <w:r>
-              <w:rPr>
-                <w:sz w:val="24"/>
-              </w:rPr>
-              <w:t>now</w:t>
-            </w:r>
-            <w:proofErr w:type="gramEnd"/>
-            <w:r>
-              <w:rPr>
-                <w:sz w:val="24"/>
-              </w:rPr>
-              <w:t xml:space="preserve"> no functionality is added to</w:t>
+            <w:r>
+              <w:rPr>
+                <w:sz w:val="24"/>
+              </w:rPr>
+              <w:t>now no functionality is added to</w:t>
             </w:r>
             <w:r>
               <w:rPr>
@@ -10913,35 +10869,7 @@
               <w:rPr>
                 <w:sz w:val="24"/>
               </w:rPr>
-              <w:t xml:space="preserve">Implemented Whisper Ai for converting Speech to </w:t>
-            </w:r>
-            <w:proofErr w:type="gramStart"/>
-            <w:r>
-              <w:rPr>
-                <w:sz w:val="24"/>
-              </w:rPr>
-              <w:t>Text .</w:t>
-            </w:r>
-            <w:proofErr w:type="gramEnd"/>
-            <w:r>
-              <w:rPr>
-                <w:sz w:val="24"/>
-              </w:rPr>
-              <w:t xml:space="preserve"> Languages will </w:t>
-            </w:r>
-            <w:proofErr w:type="gramStart"/>
-            <w:r>
-              <w:rPr>
-                <w:sz w:val="24"/>
-              </w:rPr>
-              <w:t>be  English</w:t>
-            </w:r>
-            <w:proofErr w:type="gramEnd"/>
-            <w:r>
-              <w:rPr>
-                <w:sz w:val="24"/>
-              </w:rPr>
-              <w:t xml:space="preserve"> and Urdu. Final conversation will be </w:t>
+              <w:t xml:space="preserve">Implemented Whisper Ai for converting Speech to Text . Languages will be  English and Urdu. Final conversation will be </w:t>
             </w:r>
             <w:r>
               <w:rPr>
@@ -10966,35 +10894,7 @@
               <w:rPr>
                 <w:sz w:val="24"/>
               </w:rPr>
-              <w:t xml:space="preserve">As whisper converts voice to text that text </w:t>
-            </w:r>
-            <w:proofErr w:type="gramStart"/>
-            <w:r>
-              <w:rPr>
-                <w:sz w:val="24"/>
-              </w:rPr>
-              <w:t>will be used</w:t>
-            </w:r>
-            <w:proofErr w:type="gramEnd"/>
-            <w:r>
-              <w:rPr>
-                <w:sz w:val="24"/>
-              </w:rPr>
-              <w:t xml:space="preserve"> to generate SOAP notes for doctor and extracts medical info so that patient report can be made from that. Also Updated Patient and Doctor Dashboard so information from Database </w:t>
-            </w:r>
-            <w:proofErr w:type="gramStart"/>
-            <w:r>
-              <w:rPr>
-                <w:sz w:val="24"/>
-              </w:rPr>
-              <w:t>will be displayed</w:t>
-            </w:r>
-            <w:proofErr w:type="gramEnd"/>
-            <w:r>
-              <w:rPr>
-                <w:sz w:val="24"/>
-              </w:rPr>
-              <w:t xml:space="preserve"> there.</w:t>
+              <w:t>As whisper converts voice to text that text will be used to generate SOAP notes for doctor and extracts medical info so that patient report can be made from that. Also Updated Patient and Doctor Dashboard so information from Database will be displayed there.</w:t>
             </w:r>
           </w:p>
           <w:p>
@@ -11027,21 +10927,7 @@
               <w:rPr>
                 <w:sz w:val="24"/>
               </w:rPr>
-              <w:t xml:space="preserve">In </w:t>
-            </w:r>
-            <w:proofErr w:type="gramStart"/>
-            <w:r>
-              <w:rPr>
-                <w:sz w:val="24"/>
-              </w:rPr>
-              <w:t>Doctor</w:t>
-            </w:r>
-            <w:proofErr w:type="gramEnd"/>
-            <w:r>
-              <w:rPr>
-                <w:sz w:val="24"/>
-              </w:rPr>
-              <w:t xml:space="preserve"> dashboard stats appointment and patient records are updated with real data.</w:t>
+              <w:t>In Doctor dashboard stats appointment and patient records are updated with real data.</w:t>
             </w:r>
           </w:p>
           <w:p>
@@ -11130,21 +11016,7 @@
               <w:rPr>
                 <w:sz w:val="24"/>
               </w:rPr>
-              <w:t xml:space="preserve">atient schedules </w:t>
-            </w:r>
-            <w:proofErr w:type="gramStart"/>
-            <w:r>
-              <w:rPr>
-                <w:sz w:val="24"/>
-              </w:rPr>
-              <w:t>appointment which</w:t>
-            </w:r>
-            <w:proofErr w:type="gramEnd"/>
-            <w:r>
-              <w:rPr>
-                <w:sz w:val="24"/>
-              </w:rPr>
-              <w:t xml:space="preserve"> goes into pending state until doctor confirms it in his dashboard</w:t>
+              <w:t>atient schedules appointment which goes into pending state until doctor confirms it in his dashboard</w:t>
             </w:r>
             <w:r>
               <w:rPr>
@@ -11156,21 +11028,7 @@
               <w:rPr>
                 <w:sz w:val="24"/>
               </w:rPr>
-              <w:t xml:space="preserve">Fetch appointments in patient dashboard and their </w:t>
-            </w:r>
-            <w:proofErr w:type="gramStart"/>
-            <w:r>
-              <w:rPr>
-                <w:sz w:val="24"/>
-              </w:rPr>
-              <w:t>current status</w:t>
-            </w:r>
-            <w:proofErr w:type="gramEnd"/>
-            <w:r>
-              <w:rPr>
-                <w:sz w:val="24"/>
-              </w:rPr>
-              <w:t>.</w:t>
+              <w:t>Fetch appointments in patient dashboard and their current status.</w:t>
             </w:r>
           </w:p>
           <w:p>
@@ -11222,21 +11080,7 @@
               <w:rPr>
                 <w:sz w:val="24"/>
               </w:rPr>
-              <w:t xml:space="preserve">Receptionist can also manage appointment creation </w:t>
-            </w:r>
-            <w:proofErr w:type="gramStart"/>
-            <w:r>
-              <w:rPr>
-                <w:sz w:val="24"/>
-              </w:rPr>
-              <w:t>either through individual patient or searching</w:t>
-            </w:r>
-            <w:proofErr w:type="gramEnd"/>
-            <w:r>
-              <w:rPr>
-                <w:sz w:val="24"/>
-              </w:rPr>
-              <w:t xml:space="preserve"> for both patients and doctors in schedule appointment tab.</w:t>
+              <w:t>Receptionist can also manage appointment creation either through individual patient or searching for both patients and doctors in schedule appointment tab.</w:t>
             </w:r>
           </w:p>
           <w:p>
@@ -12406,21 +12250,7 @@
               <w:rPr>
                 <w:sz w:val="24"/>
               </w:rPr>
-              <w:t xml:space="preserve">If the patient appointment is approved then he will be presented with </w:t>
-            </w:r>
-            <w:proofErr w:type="gramStart"/>
-            <w:r>
-              <w:rPr>
-                <w:sz w:val="24"/>
-              </w:rPr>
-              <w:t>bill which</w:t>
-            </w:r>
-            <w:proofErr w:type="gramEnd"/>
-            <w:r>
-              <w:rPr>
-                <w:sz w:val="24"/>
-              </w:rPr>
-              <w:t xml:space="preserve"> shows the bill of the user and asks him to choose billing method either </w:t>
+              <w:t xml:space="preserve">If the patient appointment is approved then he will be presented with bill which shows the bill of the user and asks him to choose billing method either </w:t>
             </w:r>
             <w:proofErr w:type="spellStart"/>
             <w:r>
@@ -12448,21 +12278,7 @@
               <w:rPr>
                 <w:sz w:val="24"/>
               </w:rPr>
-              <w:t xml:space="preserve"> or he is going to pay at hospital by visiting receptionist. It requires user to send it to particular account mentioned below after he choose the payment he would be asked to provide a screenshot of that payment in order to verify the payment. It will be verified by the </w:t>
-            </w:r>
-            <w:proofErr w:type="gramStart"/>
-            <w:r>
-              <w:rPr>
-                <w:sz w:val="24"/>
-              </w:rPr>
-              <w:t>receptionist .</w:t>
-            </w:r>
-            <w:proofErr w:type="gramEnd"/>
-            <w:r>
-              <w:rPr>
-                <w:sz w:val="24"/>
-              </w:rPr>
-              <w:t xml:space="preserve"> After receptionist verifies, the patient can view and download the invoice.</w:t>
+              <w:t xml:space="preserve"> or he is going to pay at hospital by visiting receptionist. It requires user to send it to particular account mentioned below after he choose the payment he would be asked to provide a screenshot of that payment in order to verify the payment. It will be verified by the receptionist . After receptionist verifies, the patient can view and download the invoice.</w:t>
             </w:r>
           </w:p>
           <w:p>
@@ -12505,21 +12321,7 @@
               <w:rPr>
                 <w:sz w:val="24"/>
               </w:rPr>
-              <w:t xml:space="preserve">. At appointments tab added a </w:t>
-            </w:r>
-            <w:proofErr w:type="gramStart"/>
-            <w:r>
-              <w:rPr>
-                <w:sz w:val="24"/>
-              </w:rPr>
-              <w:t>filter to filter</w:t>
-            </w:r>
-            <w:proofErr w:type="gramEnd"/>
-            <w:r>
-              <w:rPr>
-                <w:sz w:val="24"/>
-              </w:rPr>
-              <w:t xml:space="preserve"> appointments by all, today and upcoming.</w:t>
+              <w:t>. At appointments tab added a filter to filter appointments by all, today and upcoming.</w:t>
             </w:r>
             <w:r>
               <w:rPr>
@@ -12655,21 +12457,7 @@
               <w:rPr>
                 <w:sz w:val="24"/>
               </w:rPr>
-              <w:t xml:space="preserve">Doctor will have </w:t>
-            </w:r>
-            <w:proofErr w:type="gramStart"/>
-            <w:r>
-              <w:rPr>
-                <w:sz w:val="24"/>
-              </w:rPr>
-              <w:t>an</w:t>
-            </w:r>
-            <w:proofErr w:type="gramEnd"/>
-            <w:r>
-              <w:rPr>
-                <w:sz w:val="24"/>
-              </w:rPr>
-              <w:t xml:space="preserve"> functionality of adding his receptionist. Receptionist can chat with doctor assigned to it and the patients of that doctor. </w:t>
+              <w:t xml:space="preserve">Doctor will have an functionality of adding his receptionist. Receptionist can chat with doctor assigned to it and the patients of that doctor. </w:t>
             </w:r>
           </w:p>
           <w:p>
@@ -13085,34 +12873,21 @@
                 <w:color w:val="FFFFFF"/>
                 <w:spacing w:val="-5"/>
               </w:rPr>
-              <w:t>03</w:t>
-            </w:r>
-            <w:r>
-              <w:rPr>
-                <w:color w:val="FFFFFF"/>
-                <w:spacing w:val="-5"/>
-              </w:rPr>
-              <w:t>]</w:t>
-            </w:r>
-          </w:p>
-          <w:p>
-            <w:pPr>
-              <w:pStyle w:val="TableParagraph"/>
-              <w:rPr>
-                <w:sz w:val="24"/>
-              </w:rPr>
-            </w:pPr>
-            <w:r>
-              <w:rPr>
-                <w:color w:val="FFFFFF"/>
-              </w:rPr>
-              <w:t xml:space="preserve">      16</w:t>
-            </w:r>
-            <w:r>
-              <w:rPr>
-                <w:color w:val="FFFFFF"/>
-              </w:rPr>
-              <w:t>-Feb-2026</w:t>
+              <w:t>03]</w:t>
+            </w:r>
+          </w:p>
+          <w:p>
+            <w:pPr>
+              <w:pStyle w:val="TableParagraph"/>
+              <w:rPr>
+                <w:sz w:val="24"/>
+              </w:rPr>
+            </w:pPr>
+            <w:r>
+              <w:rPr>
+                <w:color w:val="FFFFFF"/>
+              </w:rPr>
+              <w:t xml:space="preserve">      16-Feb-2026</w:t>
             </w:r>
             <w:r>
               <w:rPr>
@@ -13140,8 +12915,6 @@
               </w:rPr>
               <w:t>22</w:t>
             </w:r>
-            <w:bookmarkStart w:id="0" w:name="_GoBack"/>
-            <w:bookmarkEnd w:id="0"/>
             <w:r>
               <w:rPr>
                 <w:color w:val="FFFFFF"/>
@@ -13184,6 +12957,76 @@
               </w:rPr>
             </w:pPr>
           </w:p>
+          <w:p>
+            <w:pPr>
+              <w:pStyle w:val="TableParagraph"/>
+              <w:numPr>
+                <w:ilvl w:val="0"/>
+                <w:numId w:val="26"/>
+              </w:numPr>
+              <w:cnfStyle w:val="000000100000" w:firstRow="0" w:lastRow="0" w:firstColumn="0" w:lastColumn="0" w:oddVBand="0" w:evenVBand="0" w:oddHBand="1" w:evenHBand="0" w:firstRowFirstColumn="0" w:firstRowLastColumn="0" w:lastRowFirstColumn="0" w:lastRowLastColumn="0"/>
+              <w:rPr>
+                <w:sz w:val="24"/>
+              </w:rPr>
+            </w:pPr>
+            <w:r>
+              <w:rPr>
+                <w:sz w:val="24"/>
+              </w:rPr>
+              <w:t xml:space="preserve">Update Messages Tab. If any new message </w:t>
+            </w:r>
+            <w:proofErr w:type="gramStart"/>
+            <w:r>
+              <w:rPr>
+                <w:sz w:val="24"/>
+              </w:rPr>
+              <w:t>is being sent or received</w:t>
+            </w:r>
+            <w:proofErr w:type="gramEnd"/>
+            <w:r>
+              <w:rPr>
+                <w:sz w:val="24"/>
+              </w:rPr>
+              <w:t xml:space="preserve"> then it will be at the top of the contacts like WhatsApp</w:t>
+            </w:r>
+            <w:r>
+              <w:rPr>
+                <w:sz w:val="24"/>
+              </w:rPr>
+              <w:t>.</w:t>
+            </w:r>
+          </w:p>
+          <w:p>
+            <w:pPr>
+              <w:pStyle w:val="TableParagraph"/>
+              <w:numPr>
+                <w:ilvl w:val="0"/>
+                <w:numId w:val="26"/>
+              </w:numPr>
+              <w:cnfStyle w:val="000000100000" w:firstRow="0" w:lastRow="0" w:firstColumn="0" w:lastColumn="0" w:oddVBand="0" w:evenVBand="0" w:oddHBand="1" w:evenHBand="0" w:firstRowFirstColumn="0" w:firstRowLastColumn="0" w:lastRowFirstColumn="0" w:lastRowLastColumn="0"/>
+              <w:rPr>
+                <w:sz w:val="24"/>
+              </w:rPr>
+            </w:pPr>
+            <w:r>
+              <w:rPr>
+                <w:sz w:val="24"/>
+              </w:rPr>
+              <w:t xml:space="preserve">Added Refund Management. </w:t>
+            </w:r>
+            <w:r>
+              <w:rPr>
+                <w:sz w:val="24"/>
+              </w:rPr>
+              <w:t>I</w:t>
+            </w:r>
+            <w:r>
+              <w:rPr>
+                <w:sz w:val="24"/>
+              </w:rPr>
+              <w:t>f the patient has paid the bill and appointment has been cancelled the refund will be auto generated and receptionist will handle this. Patient can also request for refund . the request will be sent to Receptionist.</w:t>
+            </w:r>
+          </w:p>
         </w:tc>
         <w:tc>
           <w:tcPr>
@@ -13192,6 +13035,404 @@
           <w:p>
             <w:pPr>
               <w:pStyle w:val="TableParagraph"/>
+              <w:cnfStyle w:val="000000100000" w:firstRow="0" w:lastRow="0" w:firstColumn="0" w:lastColumn="0" w:oddVBand="0" w:evenVBand="0" w:oddHBand="1" w:evenHBand="0" w:firstRowFirstColumn="0" w:firstRowLastColumn="0" w:lastRowFirstColumn="0" w:lastRowLastColumn="0"/>
+              <w:rPr>
+                <w:sz w:val="24"/>
+              </w:rPr>
+            </w:pPr>
+          </w:p>
+          <w:p>
+            <w:pPr>
+              <w:pStyle w:val="TableParagraph"/>
+              <w:numPr>
+                <w:ilvl w:val="0"/>
+                <w:numId w:val="26"/>
+              </w:numPr>
+              <w:cnfStyle w:val="000000100000" w:firstRow="0" w:lastRow="0" w:firstColumn="0" w:lastColumn="0" w:oddVBand="0" w:evenVBand="0" w:oddHBand="1" w:evenHBand="0" w:firstRowFirstColumn="0" w:firstRowLastColumn="0" w:lastRowFirstColumn="0" w:lastRowLastColumn="0"/>
+              <w:rPr>
+                <w:sz w:val="24"/>
+              </w:rPr>
+            </w:pPr>
+            <w:r>
+              <w:rPr>
+                <w:sz w:val="24"/>
+              </w:rPr>
+              <w:t>No work</w:t>
+            </w:r>
+          </w:p>
+        </w:tc>
+      </w:tr>
+      <w:tr>
+        <w:trPr>
+          <w:trHeight w:val="1875"/>
+        </w:trPr>
+        <w:tc>
+          <w:tcPr>
+            <w:cnfStyle w:val="001000000000" w:firstRow="0" w:lastRow="0" w:firstColumn="1" w:lastColumn="0" w:oddVBand="0" w:evenVBand="0" w:oddHBand="0" w:evenHBand="0" w:firstRowFirstColumn="0" w:firstRowLastColumn="0" w:lastRowFirstColumn="0" w:lastRowLastColumn="0"/>
+            <w:tcW w:w="3070" w:type="dxa"/>
+          </w:tcPr>
+          <w:p>
+            <w:pPr>
+              <w:pStyle w:val="TableParagraph"/>
+              <w:ind w:left="87" w:right="164"/>
+              <w:jc w:val="center"/>
+              <w:rPr>
+                <w:color w:val="FFFFFF"/>
+              </w:rPr>
+            </w:pPr>
+          </w:p>
+          <w:p>
+            <w:pPr>
+              <w:pStyle w:val="TableParagraph"/>
+              <w:ind w:left="87" w:right="164"/>
+              <w:jc w:val="center"/>
+              <w:rPr>
+                <w:color w:val="FFFFFF"/>
+              </w:rPr>
+            </w:pPr>
+          </w:p>
+          <w:p>
+            <w:pPr>
+              <w:pStyle w:val="TableParagraph"/>
+              <w:ind w:left="87" w:right="164"/>
+              <w:jc w:val="center"/>
+              <w:rPr>
+                <w:b w:val="0"/>
+              </w:rPr>
+            </w:pPr>
+            <w:r>
+              <w:rPr>
+                <w:color w:val="FFFFFF"/>
+              </w:rPr>
+              <w:t>[Week</w:t>
+            </w:r>
+            <w:r>
+              <w:rPr>
+                <w:color w:val="FFFFFF"/>
+                <w:spacing w:val="-10"/>
+              </w:rPr>
+              <w:t xml:space="preserve"> </w:t>
+            </w:r>
+            <w:r>
+              <w:rPr>
+                <w:color w:val="FFFFFF"/>
+                <w:spacing w:val="-5"/>
+              </w:rPr>
+              <w:t>04</w:t>
+            </w:r>
+            <w:r>
+              <w:rPr>
+                <w:color w:val="FFFFFF"/>
+                <w:spacing w:val="-5"/>
+              </w:rPr>
+              <w:t>]</w:t>
+            </w:r>
+          </w:p>
+          <w:p>
+            <w:pPr>
+              <w:pStyle w:val="TableParagraph"/>
+              <w:ind w:left="87" w:right="164"/>
+              <w:jc w:val="center"/>
+              <w:rPr>
+                <w:color w:val="FFFFFF"/>
+              </w:rPr>
+            </w:pPr>
+            <w:r>
+              <w:rPr>
+                <w:color w:val="FFFFFF"/>
+              </w:rPr>
+              <w:t xml:space="preserve">  23</w:t>
+            </w:r>
+            <w:r>
+              <w:rPr>
+                <w:color w:val="FFFFFF"/>
+              </w:rPr>
+              <w:t>-Feb-2026</w:t>
+            </w:r>
+            <w:r>
+              <w:rPr>
+                <w:color w:val="FFFFFF"/>
+                <w:spacing w:val="-8"/>
+              </w:rPr>
+              <w:t xml:space="preserve"> </w:t>
+            </w:r>
+            <w:r>
+              <w:rPr>
+                <w:color w:val="FFFFFF"/>
+              </w:rPr>
+              <w:t>-</w:t>
+            </w:r>
+            <w:r>
+              <w:rPr>
+                <w:color w:val="FFFFFF"/>
+                <w:spacing w:val="-10"/>
+              </w:rPr>
+              <w:t xml:space="preserve"> </w:t>
+            </w:r>
+            <w:r>
+              <w:rPr>
+                <w:color w:val="FFFFFF"/>
+              </w:rPr>
+              <w:t>01</w:t>
+            </w:r>
+            <w:r>
+              <w:rPr>
+                <w:color w:val="FFFFFF"/>
+                <w:spacing w:val="-7"/>
+              </w:rPr>
+              <w:t xml:space="preserve"> </w:t>
+            </w:r>
+            <w:r>
+              <w:rPr>
+                <w:color w:val="FFFFFF"/>
+              </w:rPr>
+              <w:t xml:space="preserve">Mar </w:t>
+            </w:r>
+            <w:r>
+              <w:rPr>
+                <w:color w:val="FFFFFF"/>
+                <w:spacing w:val="-4"/>
+              </w:rPr>
+              <w:t>2026</w:t>
+            </w:r>
+          </w:p>
+        </w:tc>
+        <w:tc>
+          <w:tcPr>
+            <w:tcW w:w="4230" w:type="dxa"/>
+          </w:tcPr>
+          <w:p>
+            <w:pPr>
+              <w:pStyle w:val="TableParagraph"/>
+              <w:numPr>
+                <w:ilvl w:val="0"/>
+                <w:numId w:val="28"/>
+              </w:numPr>
+              <w:cnfStyle w:val="000000000000" w:firstRow="0" w:lastRow="0" w:firstColumn="0" w:lastColumn="0" w:oddVBand="0" w:evenVBand="0" w:oddHBand="0" w:evenHBand="0" w:firstRowFirstColumn="0" w:firstRowLastColumn="0" w:lastRowFirstColumn="0" w:lastRowLastColumn="0"/>
+              <w:rPr>
+                <w:sz w:val="24"/>
+              </w:rPr>
+            </w:pPr>
+            <w:r>
+              <w:rPr>
+                <w:sz w:val="24"/>
+              </w:rPr>
+              <w:t xml:space="preserve">Update UI of Bill Verification and </w:t>
+            </w:r>
+            <w:bookmarkStart w:id="0" w:name="_GoBack"/>
+            <w:bookmarkEnd w:id="0"/>
+            <w:r>
+              <w:rPr>
+                <w:sz w:val="24"/>
+              </w:rPr>
+              <w:t>Today Appointments</w:t>
+            </w:r>
+          </w:p>
+          <w:p>
+            <w:pPr>
+              <w:pStyle w:val="TableParagraph"/>
+              <w:numPr>
+                <w:ilvl w:val="0"/>
+                <w:numId w:val="28"/>
+              </w:numPr>
+              <w:cnfStyle w:val="000000000000" w:firstRow="0" w:lastRow="0" w:firstColumn="0" w:lastColumn="0" w:oddVBand="0" w:evenVBand="0" w:oddHBand="0" w:evenHBand="0" w:firstRowFirstColumn="0" w:firstRowLastColumn="0" w:lastRowFirstColumn="0" w:lastRowLastColumn="0"/>
+              <w:rPr>
+                <w:sz w:val="24"/>
+              </w:rPr>
+            </w:pPr>
+            <w:r>
+              <w:rPr>
+                <w:sz w:val="24"/>
+              </w:rPr>
+              <w:t>Added a custom confirm dialog box</w:t>
+            </w:r>
+          </w:p>
+        </w:tc>
+        <w:tc>
+          <w:tcPr>
+            <w:tcW w:w="3850" w:type="dxa"/>
+          </w:tcPr>
+          <w:p>
+            <w:pPr>
+              <w:pStyle w:val="TableParagraph"/>
+              <w:numPr>
+                <w:ilvl w:val="0"/>
+                <w:numId w:val="27"/>
+              </w:numPr>
+              <w:cnfStyle w:val="000000000000" w:firstRow="0" w:lastRow="0" w:firstColumn="0" w:lastColumn="0" w:oddVBand="0" w:evenVBand="0" w:oddHBand="0" w:evenHBand="0" w:firstRowFirstColumn="0" w:firstRowLastColumn="0" w:lastRowFirstColumn="0" w:lastRowLastColumn="0"/>
+              <w:rPr>
+                <w:sz w:val="24"/>
+              </w:rPr>
+            </w:pPr>
+            <w:r>
+              <w:rPr>
+                <w:sz w:val="24"/>
+              </w:rPr>
+              <w:t xml:space="preserve">Update Appointments and Notifications for mark all as read in notifications , give receptionist the authority to approve or reject appointment on behalf of doctor ,live </w:t>
+            </w:r>
+            <w:r>
+              <w:rPr>
+                <w:sz w:val="24"/>
+              </w:rPr>
+              <w:t>notifications</w:t>
+            </w:r>
+            <w:r>
+              <w:rPr>
+                <w:sz w:val="24"/>
+              </w:rPr>
+              <w:t xml:space="preserve"> fix and automatic time slot assignment</w:t>
+            </w:r>
+          </w:p>
+        </w:tc>
+      </w:tr>
+      <w:tr>
+        <w:trPr>
+          <w:cnfStyle w:val="000000100000" w:firstRow="0" w:lastRow="0" w:firstColumn="0" w:lastColumn="0" w:oddVBand="0" w:evenVBand="0" w:oddHBand="1" w:evenHBand="0" w:firstRowFirstColumn="0" w:firstRowLastColumn="0" w:lastRowFirstColumn="0" w:lastRowLastColumn="0"/>
+          <w:trHeight w:val="1875"/>
+        </w:trPr>
+        <w:tc>
+          <w:tcPr>
+            <w:cnfStyle w:val="001000000000" w:firstRow="0" w:lastRow="0" w:firstColumn="1" w:lastColumn="0" w:oddVBand="0" w:evenVBand="0" w:oddHBand="0" w:evenHBand="0" w:firstRowFirstColumn="0" w:firstRowLastColumn="0" w:lastRowFirstColumn="0" w:lastRowLastColumn="0"/>
+            <w:tcW w:w="3070" w:type="dxa"/>
+          </w:tcPr>
+          <w:p>
+            <w:pPr>
+              <w:pStyle w:val="TableParagraph"/>
+              <w:ind w:left="87" w:right="164"/>
+              <w:jc w:val="center"/>
+              <w:rPr>
+                <w:color w:val="FFFFFF"/>
+              </w:rPr>
+            </w:pPr>
+          </w:p>
+          <w:p>
+            <w:pPr>
+              <w:pStyle w:val="TableParagraph"/>
+              <w:ind w:left="87" w:right="164"/>
+              <w:jc w:val="center"/>
+              <w:rPr>
+                <w:b w:val="0"/>
+              </w:rPr>
+            </w:pPr>
+            <w:r>
+              <w:rPr>
+                <w:color w:val="FFFFFF"/>
+              </w:rPr>
+              <w:t>[Week</w:t>
+            </w:r>
+            <w:r>
+              <w:rPr>
+                <w:color w:val="FFFFFF"/>
+                <w:spacing w:val="-10"/>
+              </w:rPr>
+              <w:t xml:space="preserve"> </w:t>
+            </w:r>
+            <w:r>
+              <w:rPr>
+                <w:color w:val="FFFFFF"/>
+                <w:spacing w:val="-5"/>
+              </w:rPr>
+              <w:t>05</w:t>
+            </w:r>
+            <w:r>
+              <w:rPr>
+                <w:color w:val="FFFFFF"/>
+                <w:spacing w:val="-5"/>
+              </w:rPr>
+              <w:t>]</w:t>
+            </w:r>
+          </w:p>
+          <w:p>
+            <w:pPr>
+              <w:pStyle w:val="TableParagraph"/>
+              <w:ind w:left="87" w:right="164"/>
+              <w:jc w:val="center"/>
+              <w:rPr>
+                <w:color w:val="FFFFFF"/>
+              </w:rPr>
+            </w:pPr>
+            <w:r>
+              <w:rPr>
+                <w:color w:val="FFFFFF"/>
+              </w:rPr>
+              <w:t xml:space="preserve">  02-Mar</w:t>
+            </w:r>
+            <w:r>
+              <w:rPr>
+                <w:color w:val="FFFFFF"/>
+              </w:rPr>
+              <w:t>-2026</w:t>
+            </w:r>
+            <w:r>
+              <w:rPr>
+                <w:color w:val="FFFFFF"/>
+                <w:spacing w:val="-8"/>
+              </w:rPr>
+              <w:t xml:space="preserve"> </w:t>
+            </w:r>
+            <w:r>
+              <w:rPr>
+                <w:color w:val="FFFFFF"/>
+              </w:rPr>
+              <w:t>-</w:t>
+            </w:r>
+            <w:r>
+              <w:rPr>
+                <w:color w:val="FFFFFF"/>
+                <w:spacing w:val="-10"/>
+              </w:rPr>
+              <w:t xml:space="preserve"> </w:t>
+            </w:r>
+            <w:r>
+              <w:rPr>
+                <w:color w:val="FFFFFF"/>
+              </w:rPr>
+              <w:t>08</w:t>
+            </w:r>
+            <w:r>
+              <w:rPr>
+                <w:color w:val="FFFFFF"/>
+                <w:spacing w:val="-7"/>
+              </w:rPr>
+              <w:t xml:space="preserve"> </w:t>
+            </w:r>
+            <w:r>
+              <w:rPr>
+                <w:color w:val="FFFFFF"/>
+              </w:rPr>
+              <w:t xml:space="preserve">Mar </w:t>
+            </w:r>
+            <w:r>
+              <w:rPr>
+                <w:color w:val="FFFFFF"/>
+                <w:spacing w:val="-4"/>
+              </w:rPr>
+              <w:t>2026</w:t>
+            </w:r>
+          </w:p>
+        </w:tc>
+        <w:tc>
+          <w:tcPr>
+            <w:tcW w:w="4230" w:type="dxa"/>
+          </w:tcPr>
+          <w:p>
+            <w:pPr>
+              <w:pStyle w:val="TableParagraph"/>
+              <w:cnfStyle w:val="000000100000" w:firstRow="0" w:lastRow="0" w:firstColumn="0" w:lastColumn="0" w:oddVBand="0" w:evenVBand="0" w:oddHBand="1" w:evenHBand="0" w:firstRowFirstColumn="0" w:firstRowLastColumn="0" w:lastRowFirstColumn="0" w:lastRowLastColumn="0"/>
+              <w:rPr>
+                <w:sz w:val="24"/>
+              </w:rPr>
+            </w:pPr>
+          </w:p>
+        </w:tc>
+        <w:tc>
+          <w:tcPr>
+            <w:tcW w:w="3850" w:type="dxa"/>
+          </w:tcPr>
+          <w:p>
+            <w:pPr>
+              <w:pStyle w:val="TableParagraph"/>
+              <w:ind w:left="720"/>
               <w:cnfStyle w:val="000000100000" w:firstRow="0" w:lastRow="0" w:firstColumn="0" w:lastColumn="0" w:oddVBand="0" w:evenVBand="0" w:oddHBand="1" w:evenHBand="0" w:firstRowFirstColumn="0" w:firstRowLastColumn="0" w:lastRowFirstColumn="0" w:lastRowLastColumn="0"/>
               <w:rPr>
                 <w:sz w:val="24"/>
@@ -14508,6 +14749,119 @@
     </w:lvl>
   </w:abstractNum>
   <w:abstractNum w:abstractNumId="10" w15:restartNumberingAfterBreak="0">
+    <w:nsid w:val="38112418"/>
+    <w:multiLevelType w:val="hybridMultilevel"/>
+    <w:tmpl w:val="CC661210"/>
+    <w:lvl w:ilvl="0" w:tplc="04090001">
+      <w:start w:val="1"/>
+      <w:numFmt w:val="bullet"/>
+      <w:lvlText w:val=""/>
+      <w:lvlJc w:val="left"/>
+      <w:pPr>
+        <w:ind w:left="720" w:hanging="360"/>
+      </w:pPr>
+      <w:rPr>
+        <w:rFonts w:ascii="Symbol" w:hAnsi="Symbol" w:hint="default"/>
+      </w:rPr>
+    </w:lvl>
+    <w:lvl w:ilvl="1" w:tplc="04090003" w:tentative="1">
+      <w:start w:val="1"/>
+      <w:numFmt w:val="bullet"/>
+      <w:lvlText w:val="o"/>
+      <w:lvlJc w:val="left"/>
+      <w:pPr>
+        <w:ind w:left="1440" w:hanging="360"/>
+      </w:pPr>
+      <w:rPr>
+        <w:rFonts w:ascii="Courier New" w:hAnsi="Courier New" w:cs="Courier New" w:hint="default"/>
+      </w:rPr>
+    </w:lvl>
+    <w:lvl w:ilvl="2" w:tplc="04090005" w:tentative="1">
+      <w:start w:val="1"/>
+      <w:numFmt w:val="bullet"/>
+      <w:lvlText w:val=""/>
+      <w:lvlJc w:val="left"/>
+      <w:pPr>
+        <w:ind w:left="2160" w:hanging="360"/>
+      </w:pPr>
+      <w:rPr>
+        <w:rFonts w:ascii="Wingdings" w:hAnsi="Wingdings" w:hint="default"/>
+      </w:rPr>
+    </w:lvl>
+    <w:lvl w:ilvl="3" w:tplc="04090001" w:tentative="1">
+      <w:start w:val="1"/>
+      <w:numFmt w:val="bullet"/>
+      <w:lvlText w:val=""/>
+      <w:lvlJc w:val="left"/>
+      <w:pPr>
+        <w:ind w:left="2880" w:hanging="360"/>
+      </w:pPr>
+      <w:rPr>
+        <w:rFonts w:ascii="Symbol" w:hAnsi="Symbol" w:hint="default"/>
+      </w:rPr>
+    </w:lvl>
+    <w:lvl w:ilvl="4" w:tplc="04090003" w:tentative="1">
+      <w:start w:val="1"/>
+      <w:numFmt w:val="bullet"/>
+      <w:lvlText w:val="o"/>
+      <w:lvlJc w:val="left"/>
+      <w:pPr>
+        <w:ind w:left="3600" w:hanging="360"/>
+      </w:pPr>
+      <w:rPr>
+        <w:rFonts w:ascii="Courier New" w:hAnsi="Courier New" w:cs="Courier New" w:hint="default"/>
+      </w:rPr>
+    </w:lvl>
+    <w:lvl w:ilvl="5" w:tplc="04090005" w:tentative="1">
+      <w:start w:val="1"/>
+      <w:numFmt w:val="bullet"/>
+      <w:lvlText w:val=""/>
+      <w:lvlJc w:val="left"/>
+      <w:pPr>
+        <w:ind w:left="4320" w:hanging="360"/>
+      </w:pPr>
+      <w:rPr>
+        <w:rFonts w:ascii="Wingdings" w:hAnsi="Wingdings" w:hint="default"/>
+      </w:rPr>
+    </w:lvl>
+    <w:lvl w:ilvl="6" w:tplc="04090001" w:tentative="1">
+      <w:start w:val="1"/>
+      <w:numFmt w:val="bullet"/>
+      <w:lvlText w:val=""/>
+      <w:lvlJc w:val="left"/>
+      <w:pPr>
+        <w:ind w:left="5040" w:hanging="360"/>
+      </w:pPr>
+      <w:rPr>
+        <w:rFonts w:ascii="Symbol" w:hAnsi="Symbol" w:hint="default"/>
+      </w:rPr>
+    </w:lvl>
+    <w:lvl w:ilvl="7" w:tplc="04090003" w:tentative="1">
+      <w:start w:val="1"/>
+      <w:numFmt w:val="bullet"/>
+      <w:lvlText w:val="o"/>
+      <w:lvlJc w:val="left"/>
+      <w:pPr>
+        <w:ind w:left="5760" w:hanging="360"/>
+      </w:pPr>
+      <w:rPr>
+        <w:rFonts w:ascii="Courier New" w:hAnsi="Courier New" w:cs="Courier New" w:hint="default"/>
+      </w:rPr>
+    </w:lvl>
+    <w:lvl w:ilvl="8" w:tplc="04090005" w:tentative="1">
+      <w:start w:val="1"/>
+      <w:numFmt w:val="bullet"/>
+      <w:lvlText w:val=""/>
+      <w:lvlJc w:val="left"/>
+      <w:pPr>
+        <w:ind w:left="6480" w:hanging="360"/>
+      </w:pPr>
+      <w:rPr>
+        <w:rFonts w:ascii="Wingdings" w:hAnsi="Wingdings" w:hint="default"/>
+      </w:rPr>
+    </w:lvl>
+  </w:abstractNum>
+  <w:abstractNum w:abstractNumId="11" w15:restartNumberingAfterBreak="0">
     <w:nsid w:val="3A772EF1"/>
     <w:multiLevelType w:val="hybridMultilevel"/>
     <w:tmpl w:val="18E8FC6E"/>
@@ -14620,7 +14974,7 @@
       </w:rPr>
     </w:lvl>
   </w:abstractNum>
-  <w:abstractNum w:abstractNumId="11" w15:restartNumberingAfterBreak="0">
+  <w:abstractNum w:abstractNumId="12" w15:restartNumberingAfterBreak="0">
     <w:nsid w:val="40583A40"/>
     <w:multiLevelType w:val="hybridMultilevel"/>
     <w:tmpl w:val="C90A266E"/>
@@ -14741,7 +15095,7 @@
       </w:rPr>
     </w:lvl>
   </w:abstractNum>
-  <w:abstractNum w:abstractNumId="12" w15:restartNumberingAfterBreak="0">
+  <w:abstractNum w:abstractNumId="13" w15:restartNumberingAfterBreak="0">
     <w:nsid w:val="41924CDD"/>
     <w:multiLevelType w:val="hybridMultilevel"/>
     <w:tmpl w:val="E59AF380"/>
@@ -14871,7 +15225,7 @@
       </w:rPr>
     </w:lvl>
   </w:abstractNum>
-  <w:abstractNum w:abstractNumId="13" w15:restartNumberingAfterBreak="0">
+  <w:abstractNum w:abstractNumId="14" w15:restartNumberingAfterBreak="0">
     <w:nsid w:val="45DE295F"/>
     <w:multiLevelType w:val="hybridMultilevel"/>
     <w:tmpl w:val="D96EE39A"/>
@@ -14992,7 +15346,7 @@
       </w:rPr>
     </w:lvl>
   </w:abstractNum>
-  <w:abstractNum w:abstractNumId="14" w15:restartNumberingAfterBreak="0">
+  <w:abstractNum w:abstractNumId="15" w15:restartNumberingAfterBreak="0">
     <w:nsid w:val="477B0CB2"/>
     <w:multiLevelType w:val="hybridMultilevel"/>
     <w:tmpl w:val="7C0440E4"/>
@@ -15105,7 +15459,7 @@
       </w:rPr>
     </w:lvl>
   </w:abstractNum>
-  <w:abstractNum w:abstractNumId="15" w15:restartNumberingAfterBreak="0">
+  <w:abstractNum w:abstractNumId="16" w15:restartNumberingAfterBreak="0">
     <w:nsid w:val="47832B5E"/>
     <w:multiLevelType w:val="hybridMultilevel"/>
     <w:tmpl w:val="002CEB40"/>
@@ -15226,7 +15580,7 @@
       </w:rPr>
     </w:lvl>
   </w:abstractNum>
-  <w:abstractNum w:abstractNumId="16" w15:restartNumberingAfterBreak="0">
+  <w:abstractNum w:abstractNumId="17" w15:restartNumberingAfterBreak="0">
     <w:nsid w:val="53024D4A"/>
     <w:multiLevelType w:val="hybridMultilevel"/>
     <w:tmpl w:val="90E2B54C"/>
@@ -15341,7 +15695,7 @@
       </w:rPr>
     </w:lvl>
   </w:abstractNum>
-  <w:abstractNum w:abstractNumId="17" w15:restartNumberingAfterBreak="0">
+  <w:abstractNum w:abstractNumId="18" w15:restartNumberingAfterBreak="0">
     <w:nsid w:val="53B34DCD"/>
     <w:multiLevelType w:val="hybridMultilevel"/>
     <w:tmpl w:val="D298B1F8"/>
@@ -15462,7 +15816,7 @@
       </w:rPr>
     </w:lvl>
   </w:abstractNum>
-  <w:abstractNum w:abstractNumId="18" w15:restartNumberingAfterBreak="0">
+  <w:abstractNum w:abstractNumId="19" w15:restartNumberingAfterBreak="0">
     <w:nsid w:val="57661EB7"/>
     <w:multiLevelType w:val="hybridMultilevel"/>
     <w:tmpl w:val="BCA8FCB8"/>
@@ -15574,7 +15928,120 @@
       </w:rPr>
     </w:lvl>
   </w:abstractNum>
-  <w:abstractNum w:abstractNumId="19" w15:restartNumberingAfterBreak="0">
+  <w:abstractNum w:abstractNumId="20" w15:restartNumberingAfterBreak="0">
+    <w:nsid w:val="593A51C5"/>
+    <w:multiLevelType w:val="hybridMultilevel"/>
+    <w:tmpl w:val="9536BE1A"/>
+    <w:lvl w:ilvl="0" w:tplc="04090001">
+      <w:start w:val="1"/>
+      <w:numFmt w:val="bullet"/>
+      <w:lvlText w:val=""/>
+      <w:lvlJc w:val="left"/>
+      <w:pPr>
+        <w:ind w:left="720" w:hanging="360"/>
+      </w:pPr>
+      <w:rPr>
+        <w:rFonts w:ascii="Symbol" w:hAnsi="Symbol" w:hint="default"/>
+      </w:rPr>
+    </w:lvl>
+    <w:lvl w:ilvl="1" w:tplc="04090003" w:tentative="1">
+      <w:start w:val="1"/>
+      <w:numFmt w:val="bullet"/>
+      <w:lvlText w:val="o"/>
+      <w:lvlJc w:val="left"/>
+      <w:pPr>
+        <w:ind w:left="1440" w:hanging="360"/>
+      </w:pPr>
+      <w:rPr>
+        <w:rFonts w:ascii="Courier New" w:hAnsi="Courier New" w:cs="Courier New" w:hint="default"/>
+      </w:rPr>
+    </w:lvl>
+    <w:lvl w:ilvl="2" w:tplc="04090005" w:tentative="1">
+      <w:start w:val="1"/>
+      <w:numFmt w:val="bullet"/>
+      <w:lvlText w:val=""/>
+      <w:lvlJc w:val="left"/>
+      <w:pPr>
+        <w:ind w:left="2160" w:hanging="360"/>
+      </w:pPr>
+      <w:rPr>
+        <w:rFonts w:ascii="Wingdings" w:hAnsi="Wingdings" w:hint="default"/>
+      </w:rPr>
+    </w:lvl>
+    <w:lvl w:ilvl="3" w:tplc="04090001" w:tentative="1">
+      <w:start w:val="1"/>
+      <w:numFmt w:val="bullet"/>
+      <w:lvlText w:val=""/>
+      <w:lvlJc w:val="left"/>
+      <w:pPr>
+        <w:ind w:left="2880" w:hanging="360"/>
+      </w:pPr>
+      <w:rPr>
+        <w:rFonts w:ascii="Symbol" w:hAnsi="Symbol" w:hint="default"/>
+      </w:rPr>
+    </w:lvl>
+    <w:lvl w:ilvl="4" w:tplc="04090003" w:tentative="1">
+      <w:start w:val="1"/>
+      <w:numFmt w:val="bullet"/>
+      <w:lvlText w:val="o"/>
+      <w:lvlJc w:val="left"/>
+      <w:pPr>
+        <w:ind w:left="3600" w:hanging="360"/>
+      </w:pPr>
+      <w:rPr>
+        <w:rFonts w:ascii="Courier New" w:hAnsi="Courier New" w:cs="Courier New" w:hint="default"/>
+      </w:rPr>
+    </w:lvl>
+    <w:lvl w:ilvl="5" w:tplc="04090005" w:tentative="1">
+      <w:start w:val="1"/>
+      <w:numFmt w:val="bullet"/>
+      <w:lvlText w:val=""/>
+      <w:lvlJc w:val="left"/>
+      <w:pPr>
+        <w:ind w:left="4320" w:hanging="360"/>
+      </w:pPr>
+      <w:rPr>
+        <w:rFonts w:ascii="Wingdings" w:hAnsi="Wingdings" w:hint="default"/>
+      </w:rPr>
+    </w:lvl>
+    <w:lvl w:ilvl="6" w:tplc="04090001" w:tentative="1">
+      <w:start w:val="1"/>
+      <w:numFmt w:val="bullet"/>
+      <w:lvlText w:val=""/>
+      <w:lvlJc w:val="left"/>
+      <w:pPr>
+        <w:ind w:left="5040" w:hanging="360"/>
+      </w:pPr>
+      <w:rPr>
+        <w:rFonts w:ascii="Symbol" w:hAnsi="Symbol" w:hint="default"/>
+      </w:rPr>
+    </w:lvl>
+    <w:lvl w:ilvl="7" w:tplc="04090003" w:tentative="1">
+      <w:start w:val="1"/>
+      <w:numFmt w:val="bullet"/>
+      <w:lvlText w:val="o"/>
+      <w:lvlJc w:val="left"/>
+      <w:pPr>
+        <w:ind w:left="5760" w:hanging="360"/>
+      </w:pPr>
+      <w:rPr>
+        <w:rFonts w:ascii="Courier New" w:hAnsi="Courier New" w:cs="Courier New" w:hint="default"/>
+      </w:rPr>
+    </w:lvl>
+    <w:lvl w:ilvl="8" w:tplc="04090005" w:tentative="1">
+      <w:start w:val="1"/>
+      <w:numFmt w:val="bullet"/>
+      <w:lvlText w:val=""/>
+      <w:lvlJc w:val="left"/>
+      <w:pPr>
+        <w:ind w:left="6480" w:hanging="360"/>
+      </w:pPr>
+      <w:rPr>
+        <w:rFonts w:ascii="Wingdings" w:hAnsi="Wingdings" w:hint="default"/>
+      </w:rPr>
+    </w:lvl>
+  </w:abstractNum>
+  <w:abstractNum w:abstractNumId="21" w15:restartNumberingAfterBreak="0">
     <w:nsid w:val="5BE224CC"/>
     <w:multiLevelType w:val="hybridMultilevel"/>
     <w:tmpl w:val="DA266992"/>
@@ -15695,7 +16162,7 @@
       </w:rPr>
     </w:lvl>
   </w:abstractNum>
-  <w:abstractNum w:abstractNumId="20" w15:restartNumberingAfterBreak="0">
+  <w:abstractNum w:abstractNumId="22" w15:restartNumberingAfterBreak="0">
     <w:nsid w:val="5C2E1F7B"/>
     <w:multiLevelType w:val="hybridMultilevel"/>
     <w:tmpl w:val="179C28D6"/>
@@ -15807,7 +16274,7 @@
       </w:rPr>
     </w:lvl>
   </w:abstractNum>
-  <w:abstractNum w:abstractNumId="21" w15:restartNumberingAfterBreak="0">
+  <w:abstractNum w:abstractNumId="23" w15:restartNumberingAfterBreak="0">
     <w:nsid w:val="6A2567D1"/>
     <w:multiLevelType w:val="hybridMultilevel"/>
     <w:tmpl w:val="0A940ABA"/>
@@ -15920,7 +16387,120 @@
       </w:rPr>
     </w:lvl>
   </w:abstractNum>
-  <w:abstractNum w:abstractNumId="22" w15:restartNumberingAfterBreak="0">
+  <w:abstractNum w:abstractNumId="24" w15:restartNumberingAfterBreak="0">
+    <w:nsid w:val="6C11258A"/>
+    <w:multiLevelType w:val="hybridMultilevel"/>
+    <w:tmpl w:val="D696E426"/>
+    <w:lvl w:ilvl="0" w:tplc="04090001">
+      <w:start w:val="1"/>
+      <w:numFmt w:val="bullet"/>
+      <w:lvlText w:val=""/>
+      <w:lvlJc w:val="left"/>
+      <w:pPr>
+        <w:ind w:left="720" w:hanging="360"/>
+      </w:pPr>
+      <w:rPr>
+        <w:rFonts w:ascii="Symbol" w:hAnsi="Symbol" w:hint="default"/>
+      </w:rPr>
+    </w:lvl>
+    <w:lvl w:ilvl="1" w:tplc="04090003" w:tentative="1">
+      <w:start w:val="1"/>
+      <w:numFmt w:val="bullet"/>
+      <w:lvlText w:val="o"/>
+      <w:lvlJc w:val="left"/>
+      <w:pPr>
+        <w:ind w:left="1440" w:hanging="360"/>
+      </w:pPr>
+      <w:rPr>
+        <w:rFonts w:ascii="Courier New" w:hAnsi="Courier New" w:cs="Courier New" w:hint="default"/>
+      </w:rPr>
+    </w:lvl>
+    <w:lvl w:ilvl="2" w:tplc="04090005" w:tentative="1">
+      <w:start w:val="1"/>
+      <w:numFmt w:val="bullet"/>
+      <w:lvlText w:val=""/>
+      <w:lvlJc w:val="left"/>
+      <w:pPr>
+        <w:ind w:left="2160" w:hanging="360"/>
+      </w:pPr>
+      <w:rPr>
+        <w:rFonts w:ascii="Wingdings" w:hAnsi="Wingdings" w:hint="default"/>
+      </w:rPr>
+    </w:lvl>
+    <w:lvl w:ilvl="3" w:tplc="04090001" w:tentative="1">
+      <w:start w:val="1"/>
+      <w:numFmt w:val="bullet"/>
+      <w:lvlText w:val=""/>
+      <w:lvlJc w:val="left"/>
+      <w:pPr>
+        <w:ind w:left="2880" w:hanging="360"/>
+      </w:pPr>
+      <w:rPr>
+        <w:rFonts w:ascii="Symbol" w:hAnsi="Symbol" w:hint="default"/>
+      </w:rPr>
+    </w:lvl>
+    <w:lvl w:ilvl="4" w:tplc="04090003" w:tentative="1">
+      <w:start w:val="1"/>
+      <w:numFmt w:val="bullet"/>
+      <w:lvlText w:val="o"/>
+      <w:lvlJc w:val="left"/>
+      <w:pPr>
+        <w:ind w:left="3600" w:hanging="360"/>
+      </w:pPr>
+      <w:rPr>
+        <w:rFonts w:ascii="Courier New" w:hAnsi="Courier New" w:cs="Courier New" w:hint="default"/>
+      </w:rPr>
+    </w:lvl>
+    <w:lvl w:ilvl="5" w:tplc="04090005" w:tentative="1">
+      <w:start w:val="1"/>
+      <w:numFmt w:val="bullet"/>
+      <w:lvlText w:val=""/>
+      <w:lvlJc w:val="left"/>
+      <w:pPr>
+        <w:ind w:left="4320" w:hanging="360"/>
+      </w:pPr>
+      <w:rPr>
+        <w:rFonts w:ascii="Wingdings" w:hAnsi="Wingdings" w:hint="default"/>
+      </w:rPr>
+    </w:lvl>
+    <w:lvl w:ilvl="6" w:tplc="04090001" w:tentative="1">
+      <w:start w:val="1"/>
+      <w:numFmt w:val="bullet"/>
+      <w:lvlText w:val=""/>
+      <w:lvlJc w:val="left"/>
+      <w:pPr>
+        <w:ind w:left="5040" w:hanging="360"/>
+      </w:pPr>
+      <w:rPr>
+        <w:rFonts w:ascii="Symbol" w:hAnsi="Symbol" w:hint="default"/>
+      </w:rPr>
+    </w:lvl>
+    <w:lvl w:ilvl="7" w:tplc="04090003" w:tentative="1">
+      <w:start w:val="1"/>
+      <w:numFmt w:val="bullet"/>
+      <w:lvlText w:val="o"/>
+      <w:lvlJc w:val="left"/>
+      <w:pPr>
+        <w:ind w:left="5760" w:hanging="360"/>
+      </w:pPr>
+      <w:rPr>
+        <w:rFonts w:ascii="Courier New" w:hAnsi="Courier New" w:cs="Courier New" w:hint="default"/>
+      </w:rPr>
+    </w:lvl>
+    <w:lvl w:ilvl="8" w:tplc="04090005" w:tentative="1">
+      <w:start w:val="1"/>
+      <w:numFmt w:val="bullet"/>
+      <w:lvlText w:val=""/>
+      <w:lvlJc w:val="left"/>
+      <w:pPr>
+        <w:ind w:left="6480" w:hanging="360"/>
+      </w:pPr>
+      <w:rPr>
+        <w:rFonts w:ascii="Wingdings" w:hAnsi="Wingdings" w:hint="default"/>
+      </w:rPr>
+    </w:lvl>
+  </w:abstractNum>
+  <w:abstractNum w:abstractNumId="25" w15:restartNumberingAfterBreak="0">
     <w:nsid w:val="6EE9341A"/>
     <w:multiLevelType w:val="hybridMultilevel"/>
     <w:tmpl w:val="2702F85C"/>
@@ -16033,7 +16613,7 @@
       </w:rPr>
     </w:lvl>
   </w:abstractNum>
-  <w:abstractNum w:abstractNumId="23" w15:restartNumberingAfterBreak="0">
+  <w:abstractNum w:abstractNumId="26" w15:restartNumberingAfterBreak="0">
     <w:nsid w:val="78912B40"/>
     <w:multiLevelType w:val="hybridMultilevel"/>
     <w:tmpl w:val="EC123714"/>
@@ -16154,7 +16734,7 @@
       </w:rPr>
     </w:lvl>
   </w:abstractNum>
-  <w:abstractNum w:abstractNumId="24" w15:restartNumberingAfterBreak="0">
+  <w:abstractNum w:abstractNumId="27" w15:restartNumberingAfterBreak="0">
     <w:nsid w:val="7B1E6F82"/>
     <w:multiLevelType w:val="hybridMultilevel"/>
     <w:tmpl w:val="609A7632"/>
@@ -16244,16 +16824,16 @@
     <w:abstractNumId w:val="1"/>
   </w:num>
   <w:num w:numId="2">
-    <w:abstractNumId w:val="16"/>
+    <w:abstractNumId w:val="17"/>
   </w:num>
   <w:num w:numId="3">
     <w:abstractNumId w:val="9"/>
   </w:num>
   <w:num w:numId="4">
-    <w:abstractNumId w:val="13"/>
+    <w:abstractNumId w:val="14"/>
   </w:num>
   <w:num w:numId="5">
-    <w:abstractNumId w:val="17"/>
+    <w:abstractNumId w:val="18"/>
   </w:num>
   <w:num w:numId="6">
     <w:abstractNumId w:val="3"/>
@@ -16265,19 +16845,19 @@
     <w:abstractNumId w:val="4"/>
   </w:num>
   <w:num w:numId="9">
-    <w:abstractNumId w:val="11"/>
+    <w:abstractNumId w:val="12"/>
   </w:num>
   <w:num w:numId="10">
-    <w:abstractNumId w:val="12"/>
+    <w:abstractNumId w:val="13"/>
   </w:num>
   <w:num w:numId="11">
     <w:abstractNumId w:val="7"/>
   </w:num>
   <w:num w:numId="12">
-    <w:abstractNumId w:val="19"/>
+    <w:abstractNumId w:val="21"/>
   </w:num>
   <w:num w:numId="13">
-    <w:abstractNumId w:val="23"/>
+    <w:abstractNumId w:val="26"/>
   </w:num>
   <w:num w:numId="14">
     <w:abstractNumId w:val="6"/>
@@ -16289,31 +16869,40 @@
     <w:abstractNumId w:val="2"/>
   </w:num>
   <w:num w:numId="17">
+    <w:abstractNumId w:val="16"/>
+  </w:num>
+  <w:num w:numId="18">
+    <w:abstractNumId w:val="23"/>
+  </w:num>
+  <w:num w:numId="19">
     <w:abstractNumId w:val="15"/>
   </w:num>
-  <w:num w:numId="18">
-    <w:abstractNumId w:val="21"/>
+  <w:num w:numId="20">
+    <w:abstractNumId w:val="25"/>
   </w:num>
-  <w:num w:numId="19">
-    <w:abstractNumId w:val="14"/>
-  </w:num>
-  <w:num w:numId="20">
+  <w:num w:numId="21">
     <w:abstractNumId w:val="22"/>
   </w:num>
-  <w:num w:numId="21">
-    <w:abstractNumId w:val="20"/>
-  </w:num>
   <w:num w:numId="22">
-    <w:abstractNumId w:val="18"/>
+    <w:abstractNumId w:val="19"/>
   </w:num>
   <w:num w:numId="23">
     <w:abstractNumId w:val="0"/>
   </w:num>
   <w:num w:numId="24">
-    <w:abstractNumId w:val="24"/>
+    <w:abstractNumId w:val="27"/>
   </w:num>
   <w:num w:numId="25">
+    <w:abstractNumId w:val="11"/>
+  </w:num>
+  <w:num w:numId="26">
+    <w:abstractNumId w:val="20"/>
+  </w:num>
+  <w:num w:numId="27">
     <w:abstractNumId w:val="10"/>
+  </w:num>
+  <w:num w:numId="28">
+    <w:abstractNumId w:val="24"/>
   </w:num>
 </w:numbering>
 </file>
@@ -17260,7 +17849,7 @@
 </file>
 
 <file path=customXml/itemProps1.xml><?xml version="1.0" encoding="utf-8"?>
-<ds:datastoreItem xmlns:ds="http://schemas.openxmlformats.org/officeDocument/2006/customXml" ds:itemID="{99CE3EA4-1E3D-4561-BFDA-CB1EF5EE87A3}">
+<ds:datastoreItem xmlns:ds="http://schemas.openxmlformats.org/officeDocument/2006/customXml" ds:itemID="{2657632C-5611-4C61-BCCA-44B98820E96D}">
   <ds:schemaRefs>
     <ds:schemaRef ds:uri="http://schemas.openxmlformats.org/officeDocument/2006/bibliography"/>
   </ds:schemaRefs>

</xml_diff>